<commit_message>
Add 7 new courses, update Site Content.docx, and fix linting errors
</commit_message>
<xml_diff>
--- a/Site Content.docx
+++ b/Site Content.docx
@@ -17790,6 +17790,3564 @@
         </w:rPr>
       </w:r>
     </w:p>
+    <w:p>
+      <w:r>
+        <w:br w:type="page"/>
+      </w:r>
+    </w:p>
+    <w:p>
+      <w:pPr>
+        <w:pStyle w:val="Heading1"/>
+      </w:pPr>
+      <w:r>
+        <w:t>DevSecOps Course – Engineering Secure Pipelines</w:t>
+      </w:r>
+    </w:p>
+    <w:p>
+      <w:r>
+        <w:rPr>
+          <w:i/>
+        </w:rPr>
+        <w:t>DevSecOps Course – Engineering Secure Pipelines DevSecOps Training</w:t>
+      </w:r>
+    </w:p>
+    <w:p/>
+    <w:p>
+      <w:r>
+        <w:t>Master the integration of security practices into your DevOps lifecycle. Learn SAST, DAST, Container Security, Kubernetes Hardening, Compliance as Code, and Cloud Security. Gain hands-on experience with real-world workflows used in modern secure software development and deployment environments. This program helps build a strong foundation for aspiring DevSecOps Engineers, Cloud Security Specialists, and IT professionals looking to transition into cybersecurity automation.</w:t>
+      </w:r>
+    </w:p>
+    <w:p/>
+    <w:p>
+      <w:pPr>
+        <w:pStyle w:val="Heading2"/>
+      </w:pPr>
+      <w:r>
+        <w:t>Course Overview</w:t>
+      </w:r>
+    </w:p>
+    <w:p>
+      <w:r>
+        <w:t>This DevSecOps course is designed for IT professionals, DevOps engineers, and security analysts who want to build secure, automated deployment pipelines. You will learn to integrate security checks, scanner tools, compliance frameworks, and secrets management directly into modern DevOps CI/CD loops.</w:t>
+      </w:r>
+    </w:p>
+    <w:p/>
+    <w:p>
+      <w:pPr>
+        <w:pStyle w:val="Heading2"/>
+      </w:pPr>
+      <w:r>
+        <w:t>Key Features</w:t>
+      </w:r>
+    </w:p>
+    <w:p>
+      <w:r>
+        <w:t>• Automated vulnerability scanning tools integration</w:t>
+      </w:r>
+    </w:p>
+    <w:p>
+      <w:r>
+        <w:t>• Hands-on security testing in CI/CD pipelines</w:t>
+      </w:r>
+    </w:p>
+    <w:p>
+      <w:r>
+        <w:t>• Real-world vulnerability management with DefectDojo</w:t>
+      </w:r>
+    </w:p>
+    <w:p>
+      <w:r>
+        <w:t>• Container and Kubernetes security hardening labs</w:t>
+      </w:r>
+    </w:p>
+    <w:p>
+      <w:r>
+        <w:t>• Practice secure application configuration patterns</w:t>
+      </w:r>
+    </w:p>
+    <w:p>
+      <w:r>
+        <w:t>• HashiCorp Vault secrets storage configuration</w:t>
+      </w:r>
+    </w:p>
+    <w:p/>
+    <w:p>
+      <w:pPr>
+        <w:pStyle w:val="Heading2"/>
+      </w:pPr>
+      <w:r>
+        <w:t>DevSecOps Curriculum</w:t>
+      </w:r>
+    </w:p>
+    <w:p>
+      <w:r>
+        <w:t>This DevSecOps training program is structured into 7 modules covering secure code integration, container shielding, secrets management, cloud policy compliance, and Kubernetes defense workflows.</w:t>
+      </w:r>
+    </w:p>
+    <w:p>
+      <w:pPr>
+        <w:pStyle w:val="Heading3"/>
+      </w:pPr>
+      <w:r>
+        <w:t>Module 1 – DevOps &amp; OWASP Top 10 Basics</w:t>
+      </w:r>
+    </w:p>
+    <w:p>
+      <w:r>
+        <w:t>• Understanding Shift-Left security principles</w:t>
+      </w:r>
+    </w:p>
+    <w:p>
+      <w:r>
+        <w:t>• OWASP Top 10 vulnerabilities overview</w:t>
+      </w:r>
+    </w:p>
+    <w:p>
+      <w:r>
+        <w:t>• Common DevSecOps workflows in tech companies</w:t>
+      </w:r>
+    </w:p>
+    <w:p>
+      <w:pPr>
+        <w:pStyle w:val="Heading3"/>
+      </w:pPr>
+      <w:r>
+        <w:t>Module 2 – Secure Coding &amp; Vulnerability Scanning (SAST/DAST)</w:t>
+      </w:r>
+    </w:p>
+    <w:p>
+      <w:r>
+        <w:t>• Static Application Security Testing (SAST) setup</w:t>
+      </w:r>
+    </w:p>
+    <w:p>
+      <w:r>
+        <w:t>• Dynamic Application Security Testing (DAST) flows</w:t>
+      </w:r>
+    </w:p>
+    <w:p>
+      <w:r>
+        <w:t>• Integrating SonarQube in CI/CD pipelines</w:t>
+      </w:r>
+    </w:p>
+    <w:p>
+      <w:r>
+        <w:t>• Software Bill of Materials (SBOM) and dependency scans</w:t>
+      </w:r>
+    </w:p>
+    <w:p>
+      <w:pPr>
+        <w:pStyle w:val="Heading3"/>
+      </w:pPr>
+      <w:r>
+        <w:t>Module 3 – Container &amp; Artifact Security (Trivy/Docker)</w:t>
+      </w:r>
+    </w:p>
+    <w:p>
+      <w:r>
+        <w:t>• Docker image scanning using Trivy</w:t>
+      </w:r>
+    </w:p>
+    <w:p>
+      <w:r>
+        <w:t>• Securing private container registries</w:t>
+      </w:r>
+    </w:p>
+    <w:p>
+      <w:r>
+        <w:t>• Implementing base image hardening guidelines</w:t>
+      </w:r>
+    </w:p>
+    <w:p>
+      <w:pPr>
+        <w:pStyle w:val="Heading3"/>
+      </w:pPr>
+      <w:r>
+        <w:t>Module 4 – Secrets Management (HashiCorp Vault)</w:t>
+      </w:r>
+    </w:p>
+    <w:p>
+      <w:r>
+        <w:t>• Configuring secrets in Vault storage engine</w:t>
+      </w:r>
+    </w:p>
+    <w:p>
+      <w:r>
+        <w:t>• Integrating Vault token authorization with pipelines</w:t>
+      </w:r>
+    </w:p>
+    <w:p>
+      <w:r>
+        <w:t>• Managing dynamic database credentials</w:t>
+      </w:r>
+    </w:p>
+    <w:p>
+      <w:pPr>
+        <w:pStyle w:val="Heading3"/>
+      </w:pPr>
+      <w:r>
+        <w:t>Module 5 – Infrastructure as Code (IaC) &amp; Cloud Security</w:t>
+      </w:r>
+    </w:p>
+    <w:p>
+      <w:r>
+        <w:t>• Scanning Terraform configurations for security issues</w:t>
+      </w:r>
+    </w:p>
+    <w:p>
+      <w:r>
+        <w:t>• IAM role configuration and privilege principles</w:t>
+      </w:r>
+    </w:p>
+    <w:p>
+      <w:r>
+        <w:t>• Securing AWS and Azure configurations using tfsec</w:t>
+      </w:r>
+    </w:p>
+    <w:p>
+      <w:pPr>
+        <w:pStyle w:val="Heading3"/>
+      </w:pPr>
+      <w:r>
+        <w:t>Module 6 – Kubernetes Security &amp; Admission Controllers</w:t>
+      </w:r>
+    </w:p>
+    <w:p>
+      <w:r>
+        <w:t>• Kubernetes API security hardening configurations</w:t>
+      </w:r>
+    </w:p>
+    <w:p>
+      <w:r>
+        <w:t>• Configuring RBAC roles and service accounts</w:t>
+      </w:r>
+    </w:p>
+    <w:p>
+      <w:r>
+        <w:t>• Writing policies with OPA Gatekeeper</w:t>
+      </w:r>
+    </w:p>
+    <w:p>
+      <w:pPr>
+        <w:pStyle w:val="Heading3"/>
+      </w:pPr>
+      <w:r>
+        <w:t>Module 7 – Compliance, Auditing &amp; Logging</w:t>
+      </w:r>
+    </w:p>
+    <w:p>
+      <w:r>
+        <w:t>• Setting up centralized audit logging logs</w:t>
+      </w:r>
+    </w:p>
+    <w:p>
+      <w:r>
+        <w:t>• Vulnerability reporting using DefectDojo dashboards</w:t>
+      </w:r>
+    </w:p>
+    <w:p>
+      <w:r>
+        <w:t>• Continuous compliance checks for production audits</w:t>
+      </w:r>
+    </w:p>
+    <w:p/>
+    <w:p>
+      <w:pPr>
+        <w:pStyle w:val="Heading2"/>
+      </w:pPr>
+      <w:r>
+        <w:t>Skills You’ll Master</w:t>
+      </w:r>
+    </w:p>
+    <w:p>
+      <w:r>
+        <w:t>After completing this DevSecOps course, you will gain:</w:t>
+      </w:r>
+    </w:p>
+    <w:p>
+      <w:r>
+        <w:t>• Secure CI/CD pipelines automation</w:t>
+      </w:r>
+    </w:p>
+    <w:p>
+      <w:r>
+        <w:t>• Automated security scanner integrations (SAST/DAST)</w:t>
+      </w:r>
+    </w:p>
+    <w:p>
+      <w:r>
+        <w:t>• Dependency and container vulnerability scanning</w:t>
+      </w:r>
+    </w:p>
+    <w:p>
+      <w:r>
+        <w:t>• Secrets storage and vaulting with HashiCorp Vault</w:t>
+      </w:r>
+    </w:p>
+    <w:p>
+      <w:r>
+        <w:t>• Secure Infrastructure as Code configurations</w:t>
+      </w:r>
+    </w:p>
+    <w:p>
+      <w:r>
+        <w:t>• Kubernetes cluster isolation and access controls</w:t>
+      </w:r>
+    </w:p>
+    <w:p>
+      <w:r>
+        <w:t>• Centralized security logging and metrics analysis</w:t>
+      </w:r>
+    </w:p>
+    <w:p/>
+    <w:p>
+      <w:pPr>
+        <w:pStyle w:val="Heading2"/>
+      </w:pPr>
+      <w:r>
+        <w:t>Course Highlights</w:t>
+      </w:r>
+    </w:p>
+    <w:p>
+      <w:r>
+        <w:t>• Hands-on DevSecOps implementation approach</w:t>
+      </w:r>
+    </w:p>
+    <w:p>
+      <w:r>
+        <w:t>• Focuses on enterprise secure pipeline tools</w:t>
+      </w:r>
+    </w:p>
+    <w:p>
+      <w:r>
+        <w:t>• Integration of automated static and dynamic scanners</w:t>
+      </w:r>
+    </w:p>
+    <w:p>
+      <w:r>
+        <w:t>• Clear training on container security policies</w:t>
+      </w:r>
+    </w:p>
+    <w:p>
+      <w:r>
+        <w:t>• Certification validation for Cloud &amp; security roles</w:t>
+      </w:r>
+    </w:p>
+    <w:p/>
+    <w:p>
+      <w:pPr>
+        <w:pStyle w:val="Heading2"/>
+      </w:pPr>
+      <w:r>
+        <w:t>Learning Outcomes</w:t>
+      </w:r>
+    </w:p>
+    <w:p>
+      <w:r>
+        <w:t>By the end of this course, you will be able to:</w:t>
+      </w:r>
+    </w:p>
+    <w:p>
+      <w:r>
+        <w:t>• Understand how secure development practices operate in modern IT firms</w:t>
+      </w:r>
+    </w:p>
+    <w:p>
+      <w:r>
+        <w:t>• Integrate vulnerability scanners inside GitLab CI/GitHub Actions pipelines</w:t>
+      </w:r>
+    </w:p>
+    <w:p>
+      <w:r>
+        <w:t>• Protect Docker images and configurations from CVE exposures</w:t>
+      </w:r>
+    </w:p>
+    <w:p>
+      <w:r>
+        <w:t>• Store and retrieve database credentials securely using Vault</w:t>
+      </w:r>
+    </w:p>
+    <w:p>
+      <w:r>
+        <w:t>• Secure Terraform infrastructure code deployments</w:t>
+      </w:r>
+    </w:p>
+    <w:p>
+      <w:r>
+        <w:t>• Deploy admission controller policies on Kubernetes clusters</w:t>
+      </w:r>
+    </w:p>
+    <w:p>
+      <w:r>
+        <w:t>• Coordinate security scan reports using DefectDojo dashboard</w:t>
+      </w:r>
+    </w:p>
+    <w:p/>
+    <w:p>
+      <w:pPr>
+        <w:pStyle w:val="Heading2"/>
+      </w:pPr>
+      <w:r>
+        <w:t>Program Criteria – Eligibility</w:t>
+      </w:r>
+    </w:p>
+    <w:p>
+      <w:pPr>
+        <w:pStyle w:val="Heading3"/>
+      </w:pPr>
+      <w:r>
+        <w:t>Prerequisites</w:t>
+      </w:r>
+    </w:p>
+    <w:p>
+      <w:r>
+        <w:t>• Basic knowledge of Git and Docker</w:t>
+      </w:r>
+    </w:p>
+    <w:p>
+      <w:r>
+        <w:t>• Understanding of basic CI/CD pipeline concepts</w:t>
+      </w:r>
+    </w:p>
+    <w:p>
+      <w:r>
+        <w:t>• Linux terminal familiarity</w:t>
+      </w:r>
+    </w:p>
+    <w:p>
+      <w:pPr>
+        <w:pStyle w:val="Heading3"/>
+      </w:pPr>
+      <w:r>
+        <w:t>Suitable For</w:t>
+      </w:r>
+    </w:p>
+    <w:p>
+      <w:r>
+        <w:t>• DevOps Engineers looking to specialize in security</w:t>
+      </w:r>
+    </w:p>
+    <w:p>
+      <w:r>
+        <w:t>• Security analysts moving to DevSecOps automation</w:t>
+      </w:r>
+    </w:p>
+    <w:p>
+      <w:r>
+        <w:t>• Software Developers aiming to write secure pipelines</w:t>
+      </w:r>
+    </w:p>
+    <w:p>
+      <w:r>
+        <w:t>• System engineers implementing modern DevSecOps protocols</w:t>
+      </w:r>
+    </w:p>
+    <w:p/>
+    <w:p>
+      <w:pPr>
+        <w:pStyle w:val="Heading2"/>
+      </w:pPr>
+      <w:r>
+        <w:t>Why Join This Program?</w:t>
+      </w:r>
+    </w:p>
+    <w:p>
+      <w:r>
+        <w:t>• Learn DevSecOps with practical, automated pipeline architectures</w:t>
+      </w:r>
+    </w:p>
+    <w:p>
+      <w:r>
+        <w:t>• Hands-on labs for SAST, DAST, and secrets management tools</w:t>
+      </w:r>
+    </w:p>
+    <w:p>
+      <w:r>
+        <w:t>• Prepare for Certified DevSecOps Professional (CDP) qualifications</w:t>
+      </w:r>
+    </w:p>
+    <w:p>
+      <w:r>
+        <w:t>• Gain skills required for security-enabled engineering roles</w:t>
+      </w:r>
+    </w:p>
+    <w:p/>
+    <w:p>
+      <w:pPr>
+        <w:pStyle w:val="Heading2"/>
+      </w:pPr>
+      <w:r>
+        <w:t>Frequently Asked Questions</w:t>
+      </w:r>
+    </w:p>
+    <w:p>
+      <w:r>
+        <w:rPr>
+          <w:b/>
+        </w:rPr>
+        <w:t>Is this DevSecOps course suitable for absolute beginners?</w:t>
+      </w:r>
+    </w:p>
+    <w:p>
+      <w:r>
+        <w:t>Yes. The program starts from basic Git and Docker knowledge and progresses into secure pipeline patterns.</w:t>
+      </w:r>
+    </w:p>
+    <w:p/>
+    <w:p>
+      <w:r>
+        <w:rPr>
+          <w:b/>
+        </w:rPr>
+        <w:t>Which tools are covered in this course?</w:t>
+      </w:r>
+    </w:p>
+    <w:p>
+      <w:r>
+        <w:t>We cover SonarQube, Trivy, GitGuardian, HashiCorp Vault, GitLab CI, OPA Gatekeeper, and DefectDojo.</w:t>
+      </w:r>
+    </w:p>
+    <w:p/>
+    <w:p>
+      <w:r>
+        <w:rPr>
+          <w:b/>
+        </w:rPr>
+        <w:t>What certifications will this help me prepare for?</w:t>
+      </w:r>
+    </w:p>
+    <w:p>
+      <w:r>
+        <w:t>It prepares you for Certified DevSecOps Professional (CDP) and Certified Kubernetes Security Specialist (CKS).</w:t>
+      </w:r>
+    </w:p>
+    <w:p/>
+    <w:p>
+      <w:r>
+        <w:br w:type="page"/>
+      </w:r>
+    </w:p>
+    <w:p>
+      <w:pPr>
+        <w:pStyle w:val="Heading1"/>
+      </w:pPr>
+      <w:r>
+        <w:t>CloudOps Certification Program – AWS &amp; Azure Operations</w:t>
+      </w:r>
+    </w:p>
+    <w:p>
+      <w:r>
+        <w:rPr>
+          <w:i/>
+        </w:rPr>
+        <w:t>CloudOps Certification Program – AWS &amp; Azure Operations CloudOps Training</w:t>
+      </w:r>
+    </w:p>
+    <w:p/>
+    <w:p>
+      <w:r>
+        <w:t>Master the design, deployment, cost management, and optimization of cloud infrastructure. Learn multi-cloud operations, automated backups, monitoring, and FinOps practices. Gain hands-on command over AWS and Azure services to manage cloud services efficiently. This program builds system operations skills needed for Cloud Administrators, DevOps specialists, and Cloud Engineers.</w:t>
+      </w:r>
+    </w:p>
+    <w:p/>
+    <w:p>
+      <w:pPr>
+        <w:pStyle w:val="Heading2"/>
+      </w:pPr>
+      <w:r>
+        <w:t>Course Overview</w:t>
+      </w:r>
+    </w:p>
+    <w:p>
+      <w:r>
+        <w:t>Our CloudOps Certification Program is built for IT administrators, system engineers, and developers looking to master high availability, monitoring, scalability, and financial operations (FinOps) across AWS and Azure cloud environments.</w:t>
+      </w:r>
+    </w:p>
+    <w:p/>
+    <w:p>
+      <w:pPr>
+        <w:pStyle w:val="Heading2"/>
+      </w:pPr>
+      <w:r>
+        <w:t>Key Features</w:t>
+      </w:r>
+    </w:p>
+    <w:p>
+      <w:r>
+        <w:t>• Multi-cloud administration exercises (AWS &amp; Azure)</w:t>
+      </w:r>
+    </w:p>
+    <w:p>
+      <w:r>
+        <w:t>• Cloud monitoring and dashboard creation</w:t>
+      </w:r>
+    </w:p>
+    <w:p>
+      <w:r>
+        <w:t>• Active cost audit and optimization challenge</w:t>
+      </w:r>
+    </w:p>
+    <w:p>
+      <w:r>
+        <w:t>• High availability architecture configuration</w:t>
+      </w:r>
+    </w:p>
+    <w:p>
+      <w:r>
+        <w:t>• Real-world disaster recovery implementation</w:t>
+      </w:r>
+    </w:p>
+    <w:p>
+      <w:r>
+        <w:t>• Infrastructure backup automation scripts</w:t>
+      </w:r>
+    </w:p>
+    <w:p/>
+    <w:p>
+      <w:pPr>
+        <w:pStyle w:val="Heading2"/>
+      </w:pPr>
+      <w:r>
+        <w:t>CloudOps Certification Program Curriculum</w:t>
+      </w:r>
+    </w:p>
+    <w:p>
+      <w:r>
+        <w:t>The CloudOps training curriculum covers multi-cloud systems management, high availability, storage systems, disaster planning, and FinOps cost optimizations.</w:t>
+      </w:r>
+    </w:p>
+    <w:p>
+      <w:pPr>
+        <w:pStyle w:val="Heading3"/>
+      </w:pPr>
+      <w:r>
+        <w:t>Module 1 – Cloud Operations &amp; Infrastructure Fundamentals</w:t>
+      </w:r>
+    </w:p>
+    <w:p>
+      <w:r>
+        <w:t>• AWS and Azure accounts administration setup</w:t>
+      </w:r>
+    </w:p>
+    <w:p>
+      <w:r>
+        <w:t>• Designing secure virtual network topologies (VPCs &amp; Subnets)</w:t>
+      </w:r>
+    </w:p>
+    <w:p>
+      <w:r>
+        <w:t>• Managing compute nodes (EC2, VM) and block storage systems</w:t>
+      </w:r>
+    </w:p>
+    <w:p>
+      <w:pPr>
+        <w:pStyle w:val="Heading3"/>
+      </w:pPr>
+      <w:r>
+        <w:t>Module 2 – High Availability &amp; Auto-Scaling Architecture</w:t>
+      </w:r>
+    </w:p>
+    <w:p>
+      <w:r>
+        <w:t>• Load balancing configuration strategies</w:t>
+      </w:r>
+    </w:p>
+    <w:p>
+      <w:r>
+        <w:t>• Auto-scaling configuration guidelines</w:t>
+      </w:r>
+    </w:p>
+    <w:p>
+      <w:r>
+        <w:t>• Database scaling architectures (RDS, Azure SQL)</w:t>
+      </w:r>
+    </w:p>
+    <w:p>
+      <w:pPr>
+        <w:pStyle w:val="Heading3"/>
+      </w:pPr>
+      <w:r>
+        <w:t>Module 3 – Multi-Cloud Monitoring &amp; Alerts Setup</w:t>
+      </w:r>
+    </w:p>
+    <w:p>
+      <w:r>
+        <w:t>• Monitoring systems using AWS CloudWatch and Azure Monitor</w:t>
+      </w:r>
+    </w:p>
+    <w:p>
+      <w:r>
+        <w:t>• Centralized log collection and custom metric setups</w:t>
+      </w:r>
+    </w:p>
+    <w:p>
+      <w:r>
+        <w:t>• Configuring alerts and notification endpoints</w:t>
+      </w:r>
+    </w:p>
+    <w:p>
+      <w:pPr>
+        <w:pStyle w:val="Heading3"/>
+      </w:pPr>
+      <w:r>
+        <w:t>Module 4 – Disaster Recovery, Backup &amp; Restoration</w:t>
+      </w:r>
+    </w:p>
+    <w:p>
+      <w:r>
+        <w:t>• Configuring automated backup routines</w:t>
+      </w:r>
+    </w:p>
+    <w:p>
+      <w:r>
+        <w:t>• Defining RPO and RTO target objectives</w:t>
+      </w:r>
+    </w:p>
+    <w:p>
+      <w:r>
+        <w:t>• Disaster recovery simulation drills (active-standby setups)</w:t>
+      </w:r>
+    </w:p>
+    <w:p>
+      <w:pPr>
+        <w:pStyle w:val="Heading3"/>
+      </w:pPr>
+      <w:r>
+        <w:t>Module 5 – Cloud Cost Management &amp; FinOps Framework</w:t>
+      </w:r>
+    </w:p>
+    <w:p>
+      <w:r>
+        <w:t>• Resource tagging strategies for auditing</w:t>
+      </w:r>
+    </w:p>
+    <w:p>
+      <w:r>
+        <w:t>• Detecting idle compute resources and rightsizing configurations</w:t>
+      </w:r>
+    </w:p>
+    <w:p>
+      <w:r>
+        <w:t>• Cost allocation reporting and budget thresholds</w:t>
+      </w:r>
+    </w:p>
+    <w:p>
+      <w:pPr>
+        <w:pStyle w:val="Heading3"/>
+      </w:pPr>
+      <w:r>
+        <w:t>Module 6 – Infrastructure Automation &amp; Orchestration</w:t>
+      </w:r>
+    </w:p>
+    <w:p>
+      <w:r>
+        <w:t>• Writing infrastructure setup templates with Terraform</w:t>
+      </w:r>
+    </w:p>
+    <w:p>
+      <w:r>
+        <w:t>• Automating cloud operational tasks using Python scripting</w:t>
+      </w:r>
+    </w:p>
+    <w:p>
+      <w:r>
+        <w:t>• Managing resources deployments at scale</w:t>
+      </w:r>
+    </w:p>
+    <w:p/>
+    <w:p>
+      <w:pPr>
+        <w:pStyle w:val="Heading2"/>
+      </w:pPr>
+      <w:r>
+        <w:t>Skills You’ll Master</w:t>
+      </w:r>
+    </w:p>
+    <w:p>
+      <w:r>
+        <w:t>After completing this CloudOps course, you will gain:</w:t>
+      </w:r>
+    </w:p>
+    <w:p>
+      <w:r>
+        <w:t>• AWS &amp; Azure cloud administration capabilities</w:t>
+      </w:r>
+    </w:p>
+    <w:p>
+      <w:r>
+        <w:t>• High availability network designs</w:t>
+      </w:r>
+    </w:p>
+    <w:p>
+      <w:r>
+        <w:t>• Cloud logging and alert systems configuration</w:t>
+      </w:r>
+    </w:p>
+    <w:p>
+      <w:r>
+        <w:t>• Disaster recovery and business continuity architectures</w:t>
+      </w:r>
+    </w:p>
+    <w:p>
+      <w:r>
+        <w:t>• FinOps and cost monitoring strategies</w:t>
+      </w:r>
+    </w:p>
+    <w:p>
+      <w:r>
+        <w:t>• Infrastructure setup utilizing Terraform IaC</w:t>
+      </w:r>
+    </w:p>
+    <w:p>
+      <w:r>
+        <w:t>• SysOps automation script writing</w:t>
+      </w:r>
+    </w:p>
+    <w:p/>
+    <w:p>
+      <w:pPr>
+        <w:pStyle w:val="Heading2"/>
+      </w:pPr>
+      <w:r>
+        <w:t>Course Highlights</w:t>
+      </w:r>
+    </w:p>
+    <w:p>
+      <w:r>
+        <w:t>• AWS &amp; Azure Administration</w:t>
+      </w:r>
+    </w:p>
+    <w:p>
+      <w:r>
+        <w:t>• Multi-Cloud Operations Automation</w:t>
+      </w:r>
+    </w:p>
+    <w:p>
+      <w:r>
+        <w:t>• FinOps Cost Management Strategy</w:t>
+      </w:r>
+    </w:p>
+    <w:p>
+      <w:r>
+        <w:t>• Disaster Recovery (DR) Simulation</w:t>
+      </w:r>
+    </w:p>
+    <w:p/>
+    <w:p>
+      <w:pPr>
+        <w:pStyle w:val="Heading2"/>
+      </w:pPr>
+      <w:r>
+        <w:t>Learning Outcomes</w:t>
+      </w:r>
+    </w:p>
+    <w:p>
+      <w:r>
+        <w:t>By the end of this course, you will be able to:</w:t>
+      </w:r>
+    </w:p>
+    <w:p>
+      <w:r>
+        <w:t>• Deploy services across AWS and Azure portals</w:t>
+      </w:r>
+    </w:p>
+    <w:p>
+      <w:r>
+        <w:t>• Configure load balancers and auto-scaling rules</w:t>
+      </w:r>
+    </w:p>
+    <w:p>
+      <w:r>
+        <w:t>• Construct diagnostic dashboards on AWS and Azure</w:t>
+      </w:r>
+    </w:p>
+    <w:p>
+      <w:r>
+        <w:t>• Implement automatic backup routines</w:t>
+      </w:r>
+    </w:p>
+    <w:p>
+      <w:r>
+        <w:t>• Audit cloud resource setups to identify cost leaks</w:t>
+      </w:r>
+    </w:p>
+    <w:p>
+      <w:r>
+        <w:t>• Deploy resources using Terraform configurations</w:t>
+      </w:r>
+    </w:p>
+    <w:p/>
+    <w:p>
+      <w:pPr>
+        <w:pStyle w:val="Heading2"/>
+      </w:pPr>
+      <w:r>
+        <w:t>Program Criteria – Eligibility</w:t>
+      </w:r>
+    </w:p>
+    <w:p>
+      <w:pPr>
+        <w:pStyle w:val="Heading3"/>
+      </w:pPr>
+      <w:r>
+        <w:t>Prerequisites</w:t>
+      </w:r>
+    </w:p>
+    <w:p>
+      <w:r>
+        <w:t>• Basic systems administration concepts</w:t>
+      </w:r>
+    </w:p>
+    <w:p>
+      <w:r>
+        <w:t>• General understanding of cloud computing services</w:t>
+      </w:r>
+    </w:p>
+    <w:p>
+      <w:r>
+        <w:t>• Familiarity with networking (IP, DNS, Subnets)</w:t>
+      </w:r>
+    </w:p>
+    <w:p>
+      <w:pPr>
+        <w:pStyle w:val="Heading3"/>
+      </w:pPr>
+      <w:r>
+        <w:t>Suitable For</w:t>
+      </w:r>
+    </w:p>
+    <w:p>
+      <w:r>
+        <w:t>• Cloud Administrators and Support Engineers</w:t>
+      </w:r>
+    </w:p>
+    <w:p>
+      <w:r>
+        <w:t>• System Administrators transitioning to cloud operations</w:t>
+      </w:r>
+    </w:p>
+    <w:p>
+      <w:r>
+        <w:t>• IT Managers wishing to implement FinOps cost controls</w:t>
+      </w:r>
+    </w:p>
+    <w:p>
+      <w:r>
+        <w:t>• DevOps enthusiasts starting cloud infrastructure management</w:t>
+      </w:r>
+    </w:p>
+    <w:p/>
+    <w:p>
+      <w:pPr>
+        <w:pStyle w:val="Heading2"/>
+      </w:pPr>
+      <w:r>
+        <w:t>Why Join This Program?</w:t>
+      </w:r>
+    </w:p>
+    <w:p>
+      <w:r>
+        <w:t>• Build practical multi-cloud administration competence</w:t>
+      </w:r>
+    </w:p>
+    <w:p>
+      <w:r>
+        <w:t>• Acquire highly demanded FinOps cost audit capabilities</w:t>
+      </w:r>
+    </w:p>
+    <w:p>
+      <w:r>
+        <w:t>• Understand how to execute disaster recovery strategies in real life</w:t>
+      </w:r>
+    </w:p>
+    <w:p>
+      <w:r>
+        <w:t>• Earn a CloudOps program certification</w:t>
+      </w:r>
+    </w:p>
+    <w:p/>
+    <w:p>
+      <w:pPr>
+        <w:pStyle w:val="Heading2"/>
+      </w:pPr>
+      <w:r>
+        <w:t>Frequently Asked Questions</w:t>
+      </w:r>
+    </w:p>
+    <w:p>
+      <w:r>
+        <w:rPr>
+          <w:b/>
+        </w:rPr>
+        <w:t>What is the main focus of CloudOps?</w:t>
+      </w:r>
+    </w:p>
+    <w:p>
+      <w:r>
+        <w:t>The main focus is maintaining system reliability, backup automation, cloud cost management, and systems monitoring.</w:t>
+      </w:r>
+    </w:p>
+    <w:p/>
+    <w:p>
+      <w:r>
+        <w:rPr>
+          <w:b/>
+        </w:rPr>
+        <w:t>Does the program cover multiple cloud providers?</w:t>
+      </w:r>
+    </w:p>
+    <w:p>
+      <w:r>
+        <w:t>Yes, it provides hands-on modules for both AWS (Amazon Web Services) and Microsoft Azure.</w:t>
+      </w:r>
+    </w:p>
+    <w:p/>
+    <w:p>
+      <w:r>
+        <w:rPr>
+          <w:b/>
+        </w:rPr>
+        <w:t>Will I learn FinOps and cost management?</w:t>
+      </w:r>
+    </w:p>
+    <w:p>
+      <w:r>
+        <w:t>Yes, a complete module is dedicated to cost monitoring, auditing, and cost-reduction techniques.</w:t>
+      </w:r>
+    </w:p>
+    <w:p/>
+    <w:p>
+      <w:r>
+        <w:br w:type="page"/>
+      </w:r>
+    </w:p>
+    <w:p>
+      <w:pPr>
+        <w:pStyle w:val="Heading1"/>
+      </w:pPr>
+      <w:r>
+        <w:t>AIOps Training – AI-Driven IT Operations &amp; Observability</w:t>
+      </w:r>
+    </w:p>
+    <w:p>
+      <w:r>
+        <w:rPr>
+          <w:i/>
+        </w:rPr>
+        <w:t>AIOps Training – AI-Driven IT Operations &amp; Observability Course</w:t>
+      </w:r>
+    </w:p>
+    <w:p/>
+    <w:p>
+      <w:r>
+        <w:t>Leverage AI/ML to automate log analysis, detect anomalies, predict service outages, and orchestrate incident responses. Learn observability pipelines and automated root cause analysis. This program focuses on training Site Reliability Engineers (SREs), system architects, and senior operations specialists on using AI telemetry tools to minimize system down times.</w:t>
+      </w:r>
+    </w:p>
+    <w:p/>
+    <w:p>
+      <w:pPr>
+        <w:pStyle w:val="Heading2"/>
+      </w:pPr>
+      <w:r>
+        <w:t>Course Overview</w:t>
+      </w:r>
+    </w:p>
+    <w:p>
+      <w:r>
+        <w:t>This advanced training covers Artificial Intelligence for IT Operations (AIOps). Learn to deploy machine learning anomalies detectors, build unified observability pipelines, and configure predictive auto-remediation scripts to decrease MTTR (Mean Time to Resolution).</w:t>
+      </w:r>
+    </w:p>
+    <w:p/>
+    <w:p>
+      <w:pPr>
+        <w:pStyle w:val="Heading2"/>
+      </w:pPr>
+      <w:r>
+        <w:t>Key Features</w:t>
+      </w:r>
+    </w:p>
+    <w:p>
+      <w:r>
+        <w:t>• AI-driven metric analysis and anomaly detection</w:t>
+      </w:r>
+    </w:p>
+    <w:p>
+      <w:r>
+        <w:t>• Advanced log search and parsing setup (ELK Stack)</w:t>
+      </w:r>
+    </w:p>
+    <w:p>
+      <w:r>
+        <w:t>• Dynatrace configuration for automated diagnostics</w:t>
+      </w:r>
+    </w:p>
+    <w:p>
+      <w:r>
+        <w:t>• Automated alerting using predictive algorithms</w:t>
+      </w:r>
+    </w:p>
+    <w:p>
+      <w:r>
+        <w:t>• Incident orchestration pipelines with PagerDuty</w:t>
+      </w:r>
+    </w:p>
+    <w:p>
+      <w:r>
+        <w:t>• Automated server self-healing script deployment</w:t>
+      </w:r>
+    </w:p>
+    <w:p/>
+    <w:p>
+      <w:pPr>
+        <w:pStyle w:val="Heading2"/>
+      </w:pPr>
+      <w:r>
+        <w:t>AIOps Training Curriculum</w:t>
+      </w:r>
+    </w:p>
+    <w:p>
+      <w:r>
+        <w:t>The AIOps training curriculum teaches learners to ingest, analyze, correlate, and remediate telemetry events using AI-powered pipelines.</w:t>
+      </w:r>
+    </w:p>
+    <w:p>
+      <w:pPr>
+        <w:pStyle w:val="Heading3"/>
+      </w:pPr>
+      <w:r>
+        <w:t>Module 1 – AIOps Architecture &amp; Big Data Operations</w:t>
+      </w:r>
+    </w:p>
+    <w:p>
+      <w:r>
+        <w:t>• Introduction to AIOps architecture frameworks</w:t>
+      </w:r>
+    </w:p>
+    <w:p>
+      <w:r>
+        <w:t>• Understanding big data scaling issues in telemetry</w:t>
+      </w:r>
+    </w:p>
+    <w:p>
+      <w:r>
+        <w:t>• Telemetry data models (metrics, logs, traces, events)</w:t>
+      </w:r>
+    </w:p>
+    <w:p>
+      <w:pPr>
+        <w:pStyle w:val="Heading3"/>
+      </w:pPr>
+      <w:r>
+        <w:t>Module 2 – Log Data Ingestion &amp; Observability Pipelines</w:t>
+      </w:r>
+    </w:p>
+    <w:p>
+      <w:r>
+        <w:t>• Log capture architectures using Vector and Logstash</w:t>
+      </w:r>
+    </w:p>
+    <w:p>
+      <w:r>
+        <w:t>• Parsing structured and unstructured server logs</w:t>
+      </w:r>
+    </w:p>
+    <w:p>
+      <w:r>
+        <w:t>• Configuring unified telemetry pipelines</w:t>
+      </w:r>
+    </w:p>
+    <w:p>
+      <w:pPr>
+        <w:pStyle w:val="Heading3"/>
+      </w:pPr>
+      <w:r>
+        <w:t>Module 3 – Machine Learning for Anomaly &amp; Outlier Detection</w:t>
+      </w:r>
+    </w:p>
+    <w:p>
+      <w:r>
+        <w:t>• Deploying ML models for anomaly baseline metrics</w:t>
+      </w:r>
+    </w:p>
+    <w:p>
+      <w:r>
+        <w:t>• Identifying seasonality shifts and baseline trends</w:t>
+      </w:r>
+    </w:p>
+    <w:p>
+      <w:r>
+        <w:t>• Configuring statistical filters for alert noise control</w:t>
+      </w:r>
+    </w:p>
+    <w:p>
+      <w:pPr>
+        <w:pStyle w:val="Heading3"/>
+      </w:pPr>
+      <w:r>
+        <w:t>Module 4 – Predictive Monitoring &amp; Intelligent Alerts</w:t>
+      </w:r>
+    </w:p>
+    <w:p>
+      <w:r>
+        <w:t>• Forecasting storage capacity exhaustions using ML models</w:t>
+      </w:r>
+    </w:p>
+    <w:p>
+      <w:r>
+        <w:t>• Creating correlation models across multiple alerting zones</w:t>
+      </w:r>
+    </w:p>
+    <w:p>
+      <w:r>
+        <w:t>• Setting predictive alarms using Dynatrace features</w:t>
+      </w:r>
+    </w:p>
+    <w:p>
+      <w:pPr>
+        <w:pStyle w:val="Heading3"/>
+      </w:pPr>
+      <w:r>
+        <w:t>Module 5 – Automated Root Cause Analysis (RCA)</w:t>
+      </w:r>
+    </w:p>
+    <w:p>
+      <w:r>
+        <w:t>• Distributed tracing diagnostics for microservices dependencies</w:t>
+      </w:r>
+    </w:p>
+    <w:p>
+      <w:r>
+        <w:t>• Mapping transaction failures to root infrastructure failures</w:t>
+      </w:r>
+    </w:p>
+    <w:p>
+      <w:r>
+        <w:t>• Using AI correlation panels to discover error origins</w:t>
+      </w:r>
+    </w:p>
+    <w:p>
+      <w:pPr>
+        <w:pStyle w:val="Heading3"/>
+      </w:pPr>
+      <w:r>
+        <w:t>Module 6 – Incident Auto-Remediation &amp; Self-Healing</w:t>
+      </w:r>
+    </w:p>
+    <w:p>
+      <w:r>
+        <w:t>• Orchestrating incident lifecycles using PagerDuty API integrations</w:t>
+      </w:r>
+    </w:p>
+    <w:p>
+      <w:r>
+        <w:t>• Writing server self-healing automation scripts (Ansible/Python)</w:t>
+      </w:r>
+    </w:p>
+    <w:p>
+      <w:r>
+        <w:t>• Designing feedback controls for automated operations</w:t>
+      </w:r>
+    </w:p>
+    <w:p/>
+    <w:p>
+      <w:pPr>
+        <w:pStyle w:val="Heading2"/>
+      </w:pPr>
+      <w:r>
+        <w:t>Skills You’ll Master</w:t>
+      </w:r>
+    </w:p>
+    <w:p>
+      <w:r>
+        <w:t>After completing this AIOps Training – AI-Driven IT Operations &amp; Observability course, you will gain:</w:t>
+      </w:r>
+    </w:p>
+    <w:p>
+      <w:r>
+        <w:t>• Log anomaly detection using ML</w:t>
+      </w:r>
+    </w:p>
+    <w:p>
+      <w:r>
+        <w:t>• ELK telemetry pipelines setup</w:t>
+      </w:r>
+    </w:p>
+    <w:p>
+      <w:r>
+        <w:t>• Dynatrace analytics configuration</w:t>
+      </w:r>
+    </w:p>
+    <w:p>
+      <w:r>
+        <w:t>• Predictive alerting implementation</w:t>
+      </w:r>
+    </w:p>
+    <w:p>
+      <w:r>
+        <w:t>• PagerDuty incident automation configurations</w:t>
+      </w:r>
+    </w:p>
+    <w:p>
+      <w:r>
+        <w:t>• Incident self-healing script engineering</w:t>
+      </w:r>
+    </w:p>
+    <w:p/>
+    <w:p>
+      <w:pPr>
+        <w:pStyle w:val="Heading2"/>
+      </w:pPr>
+      <w:r>
+        <w:t>Course Highlights</w:t>
+      </w:r>
+    </w:p>
+    <w:p>
+      <w:r>
+        <w:t>• Automated Root Cause Detection</w:t>
+      </w:r>
+    </w:p>
+    <w:p>
+      <w:r>
+        <w:t>• AI-Driven Observability Pipelines</w:t>
+      </w:r>
+    </w:p>
+    <w:p>
+      <w:r>
+        <w:t>• Predictive Incident Management</w:t>
+      </w:r>
+    </w:p>
+    <w:p>
+      <w:r>
+        <w:t>• Auto-Remediation Workflow</w:t>
+      </w:r>
+    </w:p>
+    <w:p/>
+    <w:p>
+      <w:pPr>
+        <w:pStyle w:val="Heading2"/>
+      </w:pPr>
+      <w:r>
+        <w:t>Learning Outcomes</w:t>
+      </w:r>
+    </w:p>
+    <w:p>
+      <w:r>
+        <w:t>By the end of this course, you will be able to:</w:t>
+      </w:r>
+    </w:p>
+    <w:p>
+      <w:r>
+        <w:t>• Configure ML models to capture baseline telemetry behaviors</w:t>
+      </w:r>
+    </w:p>
+    <w:p>
+      <w:r>
+        <w:t>• Deploy telemetry ingestion streams using Logstash and Vector</w:t>
+      </w:r>
+    </w:p>
+    <w:p>
+      <w:r>
+        <w:t>• Isolate baseline performance shifts from real outages</w:t>
+      </w:r>
+    </w:p>
+    <w:p>
+      <w:r>
+        <w:t>• Setup intelligent alerts to preempt storage exhaustions</w:t>
+      </w:r>
+    </w:p>
+    <w:p>
+      <w:r>
+        <w:t>• Correlate log anomalies to speed up troubleshooting workflows</w:t>
+      </w:r>
+    </w:p>
+    <w:p>
+      <w:r>
+        <w:t>• Orchestrate automatic incident responses using PagerDuty and scripts</w:t>
+      </w:r>
+    </w:p>
+    <w:p/>
+    <w:p>
+      <w:pPr>
+        <w:pStyle w:val="Heading2"/>
+      </w:pPr>
+      <w:r>
+        <w:t>Program Criteria – Eligibility</w:t>
+      </w:r>
+    </w:p>
+    <w:p>
+      <w:pPr>
+        <w:pStyle w:val="Heading3"/>
+      </w:pPr>
+      <w:r>
+        <w:t>Prerequisites</w:t>
+      </w:r>
+    </w:p>
+    <w:p>
+      <w:r>
+        <w:t>• Familiarity with DevOps monitoring tools (Prometheus, Grafana)</w:t>
+      </w:r>
+    </w:p>
+    <w:p>
+      <w:r>
+        <w:t>• Basic scripting experience (Python/Shell)</w:t>
+      </w:r>
+    </w:p>
+    <w:p>
+      <w:r>
+        <w:t>• Systems or DevOps engineering work background</w:t>
+      </w:r>
+    </w:p>
+    <w:p>
+      <w:pPr>
+        <w:pStyle w:val="Heading3"/>
+      </w:pPr>
+      <w:r>
+        <w:t>Suitable For</w:t>
+      </w:r>
+    </w:p>
+    <w:p>
+      <w:r>
+        <w:t>• Site Reliability Engineers (SREs) aiming for automation</w:t>
+      </w:r>
+    </w:p>
+    <w:p>
+      <w:r>
+        <w:t>• DevOps Engineers designing enterprise observability</w:t>
+      </w:r>
+    </w:p>
+    <w:p>
+      <w:r>
+        <w:t>• Systems Architecture Leads managing large systems</w:t>
+      </w:r>
+    </w:p>
+    <w:p>
+      <w:r>
+        <w:t>• Operations professionals scaling monitoring infrastructure</w:t>
+      </w:r>
+    </w:p>
+    <w:p/>
+    <w:p>
+      <w:pPr>
+        <w:pStyle w:val="Heading2"/>
+      </w:pPr>
+      <w:r>
+        <w:t>Why Join This Program?</w:t>
+      </w:r>
+    </w:p>
+    <w:p>
+      <w:r>
+        <w:t>• Gain cutting-edge incident automation capabilities</w:t>
+      </w:r>
+    </w:p>
+    <w:p>
+      <w:r>
+        <w:t>• Understand how to setup self-healing production server infrastructures</w:t>
+      </w:r>
+    </w:p>
+    <w:p>
+      <w:r>
+        <w:t>• Acquire skills using enterprise platforms like Dynatrace and Elasticsearch</w:t>
+      </w:r>
+    </w:p>
+    <w:p>
+      <w:r>
+        <w:t>• Transition into automated SRE architectural responsibilities</w:t>
+      </w:r>
+    </w:p>
+    <w:p/>
+    <w:p>
+      <w:pPr>
+        <w:pStyle w:val="Heading2"/>
+      </w:pPr>
+      <w:r>
+        <w:t>Frequently Asked Questions</w:t>
+      </w:r>
+    </w:p>
+    <w:p>
+      <w:r>
+        <w:rPr>
+          <w:b/>
+        </w:rPr>
+        <w:t>Do I need a deep data science background?</w:t>
+      </w:r>
+    </w:p>
+    <w:p>
+      <w:r>
+        <w:t>No, we focus on utilizing existing AIOps platforms, machine learning log aggregators, and anomaly detection rules.</w:t>
+      </w:r>
+    </w:p>
+    <w:p/>
+    <w:p>
+      <w:r>
+        <w:rPr>
+          <w:b/>
+        </w:rPr>
+        <w:t>Which AIOps tools will we use?</w:t>
+      </w:r>
+    </w:p>
+    <w:p>
+      <w:r>
+        <w:t>You will work with Dynatrace, Elasticsearch, Kibana ML features, Prometheus AI exporters, and PagerDuty.</w:t>
+      </w:r>
+    </w:p>
+    <w:p/>
+    <w:p>
+      <w:r>
+        <w:rPr>
+          <w:b/>
+        </w:rPr>
+        <w:t>How does AIOps differ from standard monitoring?</w:t>
+      </w:r>
+    </w:p>
+    <w:p>
+      <w:r>
+        <w:t>Standard monitoring triggers alerts on thresholds, whereas AIOps uses AI to analyze patterns, predict failures, and suggest root causes.</w:t>
+      </w:r>
+    </w:p>
+    <w:p/>
+    <w:p>
+      <w:r>
+        <w:br w:type="page"/>
+      </w:r>
+    </w:p>
+    <w:p>
+      <w:pPr>
+        <w:pStyle w:val="Heading1"/>
+      </w:pPr>
+      <w:r>
+        <w:t>MLOps Engineering Program – Production ML Pipelines</w:t>
+      </w:r>
+    </w:p>
+    <w:p>
+      <w:r>
+        <w:rPr>
+          <w:i/>
+        </w:rPr>
+        <w:t>MLOps Engineering Program – Production ML Pipelines Training</w:t>
+      </w:r>
+    </w:p>
+    <w:p/>
+    <w:p>
+      <w:r>
+        <w:t>Master the deployment, scaling, versioning, and continuous monitoring of Machine Learning models in production. Learn MLflow, Kubeflow, DVC, Feature Stores, and Drift Detection. This course bridges the gap between data science and operational systems engineering, preparing MLOps Engineers, Data Engineers, and Cloud Specialists.</w:t>
+      </w:r>
+    </w:p>
+    <w:p/>
+    <w:p>
+      <w:pPr>
+        <w:pStyle w:val="Heading2"/>
+      </w:pPr>
+      <w:r>
+        <w:t>Course Overview</w:t>
+      </w:r>
+    </w:p>
+    <w:p>
+      <w:r>
+        <w:t>This MLOps course provides software developers and data scientists with the capabilities to design end-to-end machine learning operational architectures. You will build containerized deployment configurations, automate data pipelines, track model experiments, and monitor production predictions.</w:t>
+      </w:r>
+    </w:p>
+    <w:p/>
+    <w:p>
+      <w:pPr>
+        <w:pStyle w:val="Heading2"/>
+      </w:pPr>
+      <w:r>
+        <w:t>Key Features</w:t>
+      </w:r>
+    </w:p>
+    <w:p>
+      <w:r>
+        <w:t>• End-to-end ML pipeline creation from data to deploy</w:t>
+      </w:r>
+    </w:p>
+    <w:p>
+      <w:r>
+        <w:t>• Data versioning and caching using DVC</w:t>
+      </w:r>
+    </w:p>
+    <w:p>
+      <w:r>
+        <w:t>• Model performance tracking and registration using MLflow</w:t>
+      </w:r>
+    </w:p>
+    <w:p>
+      <w:r>
+        <w:t>• Microservice deployment using Kubernetes and Seldon Core</w:t>
+      </w:r>
+    </w:p>
+    <w:p>
+      <w:r>
+        <w:t>• Automated model drift detection and alert setup</w:t>
+      </w:r>
+    </w:p>
+    <w:p>
+      <w:r>
+        <w:t>• Pipeline automation via CI/CD and Continuous Training</w:t>
+      </w:r>
+    </w:p>
+    <w:p/>
+    <w:p>
+      <w:pPr>
+        <w:pStyle w:val="Heading2"/>
+      </w:pPr>
+      <w:r>
+        <w:t>MLOps Engineering Program Curriculum</w:t>
+      </w:r>
+    </w:p>
+    <w:p>
+      <w:r>
+        <w:t>The MLOps training curriculum runs through data pipeline version control, model tracking, production deployments, and automated continuous training structures.</w:t>
+      </w:r>
+    </w:p>
+    <w:p>
+      <w:pPr>
+        <w:pStyle w:val="Heading3"/>
+      </w:pPr>
+      <w:r>
+        <w:t>Module 1 – MLOps Architecture &amp; Fundamentals</w:t>
+      </w:r>
+    </w:p>
+    <w:p>
+      <w:r>
+        <w:t>• Machine learning lifecycle vs traditional SDLC structures</w:t>
+      </w:r>
+    </w:p>
+    <w:p>
+      <w:r>
+        <w:t>• Understanding dependencies and state management challenges</w:t>
+      </w:r>
+    </w:p>
+    <w:p>
+      <w:r>
+        <w:t>• Setting up the Python virtual environment tools</w:t>
+      </w:r>
+    </w:p>
+    <w:p>
+      <w:pPr>
+        <w:pStyle w:val="Heading3"/>
+      </w:pPr>
+      <w:r>
+        <w:t>Module 2 – Data Version Control (DVC) &amp; Feature Stores</w:t>
+      </w:r>
+    </w:p>
+    <w:p>
+      <w:r>
+        <w:t>• Tracking large data artifacts using DVC files</w:t>
+      </w:r>
+    </w:p>
+    <w:p>
+      <w:r>
+        <w:t>• Configuring remote storage backends (S3, Cloud Storage)</w:t>
+      </w:r>
+    </w:p>
+    <w:p>
+      <w:r>
+        <w:t>• Building and querying centralized Feature Stores</w:t>
+      </w:r>
+    </w:p>
+    <w:p>
+      <w:pPr>
+        <w:pStyle w:val="Heading3"/>
+      </w:pPr>
+      <w:r>
+        <w:t>Module 3 – Experiment Tracking &amp; Model Registry (MLflow)</w:t>
+      </w:r>
+    </w:p>
+    <w:p>
+      <w:r>
+        <w:t>• Logging hyperparameters, metrics, and models using MLflow API</w:t>
+      </w:r>
+    </w:p>
+    <w:p>
+      <w:r>
+        <w:t>• Registering models and managing transition statuses</w:t>
+      </w:r>
+    </w:p>
+    <w:p>
+      <w:r>
+        <w:t>• Configuring MLflow tracking server instances</w:t>
+      </w:r>
+    </w:p>
+    <w:p>
+      <w:pPr>
+        <w:pStyle w:val="Heading3"/>
+      </w:pPr>
+      <w:r>
+        <w:t>Module 4 – Deployment &amp; Container Orchestration (Kubeflow)</w:t>
+      </w:r>
+    </w:p>
+    <w:p>
+      <w:r>
+        <w:t>• Packaging models as REST service containers using Docker</w:t>
+      </w:r>
+    </w:p>
+    <w:p>
+      <w:r>
+        <w:t>• Configuring Kubernetes clusters for model servers</w:t>
+      </w:r>
+    </w:p>
+    <w:p>
+      <w:r>
+        <w:t>• Writing Kubeflow pipeline pipelines</w:t>
+      </w:r>
+    </w:p>
+    <w:p>
+      <w:pPr>
+        <w:pStyle w:val="Heading3"/>
+      </w:pPr>
+      <w:r>
+        <w:t>Module 5 – Model Deployment Strategies</w:t>
+      </w:r>
+    </w:p>
+    <w:p>
+      <w:r>
+        <w:t>• Implementing Canary and Shadow model updates</w:t>
+      </w:r>
+    </w:p>
+    <w:p>
+      <w:r>
+        <w:t>• Configuring ingress controllers for traffic splitting</w:t>
+      </w:r>
+    </w:p>
+    <w:p>
+      <w:r>
+        <w:t>• Using Seldon Core and BentoML tools</w:t>
+      </w:r>
+    </w:p>
+    <w:p>
+      <w:pPr>
+        <w:pStyle w:val="Heading3"/>
+      </w:pPr>
+      <w:r>
+        <w:t>Module 6 – Model Monitoring, Drift &amp; Alert Systems</w:t>
+      </w:r>
+    </w:p>
+    <w:p>
+      <w:r>
+        <w:t>• Capturing inference logs and request-response payloads</w:t>
+      </w:r>
+    </w:p>
+    <w:p>
+      <w:r>
+        <w:t>• Detecting data drift and concept drift metrics</w:t>
+      </w:r>
+    </w:p>
+    <w:p>
+      <w:r>
+        <w:t>• Setting up Prometheus monitoring for ML metrics</w:t>
+      </w:r>
+    </w:p>
+    <w:p>
+      <w:pPr>
+        <w:pStyle w:val="Heading3"/>
+      </w:pPr>
+      <w:r>
+        <w:t>Module 7 – Continuous Integration, Deployment &amp; Training (CI/CD/CT)</w:t>
+      </w:r>
+    </w:p>
+    <w:p>
+      <w:r>
+        <w:t>• Creating GitHub Actions workflows for ML testing</w:t>
+      </w:r>
+    </w:p>
+    <w:p>
+      <w:r>
+        <w:t>• Automating model retraining scripts on metric dropouts</w:t>
+      </w:r>
+    </w:p>
+    <w:p>
+      <w:r>
+        <w:t>• Implementing model validation checks before production release</w:t>
+      </w:r>
+    </w:p>
+    <w:p/>
+    <w:p>
+      <w:pPr>
+        <w:pStyle w:val="Heading2"/>
+      </w:pPr>
+      <w:r>
+        <w:t>Skills You’ll Master</w:t>
+      </w:r>
+    </w:p>
+    <w:p>
+      <w:r>
+        <w:t>After completing this MLOps Engineering course, you will gain:</w:t>
+      </w:r>
+    </w:p>
+    <w:p>
+      <w:r>
+        <w:t>• Data and dataset version control using DVC</w:t>
+      </w:r>
+    </w:p>
+    <w:p>
+      <w:r>
+        <w:t>• Model lifecycle logging using MLflow registries</w:t>
+      </w:r>
+    </w:p>
+    <w:p>
+      <w:r>
+        <w:t>• Docker and Kubernetes model deployments</w:t>
+      </w:r>
+    </w:p>
+    <w:p>
+      <w:r>
+        <w:t>• Concept and data drift diagnostics configuration</w:t>
+      </w:r>
+    </w:p>
+    <w:p>
+      <w:r>
+        <w:t>• Continuous training (CT) loop automation</w:t>
+      </w:r>
+    </w:p>
+    <w:p>
+      <w:r>
+        <w:t>• CI/CD automation pipelines for machine learning models</w:t>
+      </w:r>
+    </w:p>
+    <w:p/>
+    <w:p>
+      <w:pPr>
+        <w:pStyle w:val="Heading2"/>
+      </w:pPr>
+      <w:r>
+        <w:t>Course Highlights</w:t>
+      </w:r>
+    </w:p>
+    <w:p>
+      <w:r>
+        <w:t>• Automated Pipeline Orchestration</w:t>
+      </w:r>
+    </w:p>
+    <w:p>
+      <w:r>
+        <w:t>• Data &amp; Model Versioning (DVC)</w:t>
+      </w:r>
+    </w:p>
+    <w:p>
+      <w:r>
+        <w:t>• Continuous Retraining (CT)</w:t>
+      </w:r>
+    </w:p>
+    <w:p>
+      <w:r>
+        <w:t>• Model Quality &amp; Drift Monitoring</w:t>
+      </w:r>
+    </w:p>
+    <w:p/>
+    <w:p>
+      <w:pPr>
+        <w:pStyle w:val="Heading2"/>
+      </w:pPr>
+      <w:r>
+        <w:t>Learning Outcomes</w:t>
+      </w:r>
+    </w:p>
+    <w:p>
+      <w:r>
+        <w:t>By the end of this course, you will be able to:</w:t>
+      </w:r>
+    </w:p>
+    <w:p>
+      <w:r>
+        <w:t>• Construct reproducible pipeline configurations utilizing DVC</w:t>
+      </w:r>
+    </w:p>
+    <w:p>
+      <w:r>
+        <w:t>• Log model hyper-parameters and check model registry status using MLflow</w:t>
+      </w:r>
+    </w:p>
+    <w:p>
+      <w:r>
+        <w:t>• Compile and package models inside Docker web service interfaces</w:t>
+      </w:r>
+    </w:p>
+    <w:p>
+      <w:r>
+        <w:t>• Deploy server infrastructures on Kubernetes to serve predictions</w:t>
+      </w:r>
+    </w:p>
+    <w:p>
+      <w:r>
+        <w:t>• Configure automatic alerts for data drifts detections</w:t>
+      </w:r>
+    </w:p>
+    <w:p>
+      <w:r>
+        <w:t>• Implement automated triggers to launch model retraining workflows</w:t>
+      </w:r>
+    </w:p>
+    <w:p/>
+    <w:p>
+      <w:pPr>
+        <w:pStyle w:val="Heading2"/>
+      </w:pPr>
+      <w:r>
+        <w:t>Program Criteria – Eligibility</w:t>
+      </w:r>
+    </w:p>
+    <w:p>
+      <w:pPr>
+        <w:pStyle w:val="Heading3"/>
+      </w:pPr>
+      <w:r>
+        <w:t>Prerequisites</w:t>
+      </w:r>
+    </w:p>
+    <w:p>
+      <w:r>
+        <w:t>• Good command of Python programming</w:t>
+      </w:r>
+    </w:p>
+    <w:p>
+      <w:r>
+        <w:t>• Understanding of Machine Learning pipeline basics</w:t>
+      </w:r>
+    </w:p>
+    <w:p>
+      <w:r>
+        <w:t>• Docker containerization fundamentals</w:t>
+      </w:r>
+    </w:p>
+    <w:p>
+      <w:pPr>
+        <w:pStyle w:val="Heading3"/>
+      </w:pPr>
+      <w:r>
+        <w:t>Suitable For</w:t>
+      </w:r>
+    </w:p>
+    <w:p>
+      <w:r>
+        <w:t>• Data Scientists transitioning models to production</w:t>
+      </w:r>
+    </w:p>
+    <w:p>
+      <w:r>
+        <w:t>• Machine Learning Engineers building infrastructure</w:t>
+      </w:r>
+    </w:p>
+    <w:p>
+      <w:r>
+        <w:t>• DevOps Engineers wishing to specialize in ML operations</w:t>
+      </w:r>
+    </w:p>
+    <w:p>
+      <w:r>
+        <w:t>• Tech leads overseeing enterprise AI applications</w:t>
+      </w:r>
+    </w:p>
+    <w:p/>
+    <w:p>
+      <w:pPr>
+        <w:pStyle w:val="Heading2"/>
+      </w:pPr>
+      <w:r>
+        <w:t>Why Join This Program?</w:t>
+      </w:r>
+    </w:p>
+    <w:p>
+      <w:r>
+        <w:t>• Build production-grade machine learning pipelines</w:t>
+      </w:r>
+    </w:p>
+    <w:p>
+      <w:r>
+        <w:t>• Learn how to manage model drifts and update releases safely</w:t>
+      </w:r>
+    </w:p>
+    <w:p>
+      <w:r>
+        <w:t>• Understand Kubernetes and Kubeflow scaling requirements</w:t>
+      </w:r>
+    </w:p>
+    <w:p>
+      <w:r>
+        <w:t>• Gain certification in MLOps engineering frameworks</w:t>
+      </w:r>
+    </w:p>
+    <w:p/>
+    <w:p>
+      <w:pPr>
+        <w:pStyle w:val="Heading2"/>
+      </w:pPr>
+      <w:r>
+        <w:t>Frequently Asked Questions</w:t>
+      </w:r>
+    </w:p>
+    <w:p>
+      <w:r>
+        <w:rPr>
+          <w:b/>
+        </w:rPr>
+        <w:t>Does this course teach machine learning algorithms?</w:t>
+      </w:r>
+    </w:p>
+    <w:p>
+      <w:r>
+        <w:t>No. The focus is strictly on operations (MLOps)—packaging, deploying, versioning, and monitoring existing models.</w:t>
+      </w:r>
+    </w:p>
+    <w:p/>
+    <w:p>
+      <w:r>
+        <w:rPr>
+          <w:b/>
+        </w:rPr>
+        <w:t>Will we work with cloud deployment?</w:t>
+      </w:r>
+    </w:p>
+    <w:p>
+      <w:r>
+        <w:t>Yes, we deploy pipelines using Kubernetes clusters on cloud infrastructure.</w:t>
+      </w:r>
+    </w:p>
+    <w:p/>
+    <w:p>
+      <w:r>
+        <w:rPr>
+          <w:b/>
+        </w:rPr>
+        <w:t>What tools are required for this course?</w:t>
+      </w:r>
+    </w:p>
+    <w:p>
+      <w:r>
+        <w:t>Python, Git, Docker, MLflow, DVC, Kubeflow, and Prometheus.</w:t>
+      </w:r>
+    </w:p>
+    <w:p/>
+    <w:p>
+      <w:r>
+        <w:br w:type="page"/>
+      </w:r>
+    </w:p>
+    <w:p>
+      <w:pPr>
+        <w:pStyle w:val="Heading1"/>
+      </w:pPr>
+      <w:r>
+        <w:t>Application Security Certification – Secure Web Apps</w:t>
+      </w:r>
+    </w:p>
+    <w:p>
+      <w:r>
+        <w:rPr>
+          <w:i/>
+        </w:rPr>
+        <w:t>Application Security Certification – Secure Web Apps Training</w:t>
+      </w:r>
+    </w:p>
+    <w:p/>
+    <w:p>
+      <w:r>
+        <w:t>Learn secure software development practices, threat modeling, security code review, and defense strategies against OWASP Top 10 vulnerabilities and API attacks. Build code-level security capabilities required for Security Engineers, Web Developers, and Software QA Experts.</w:t>
+      </w:r>
+    </w:p>
+    <w:p/>
+    <w:p>
+      <w:pPr>
+        <w:pStyle w:val="Heading2"/>
+      </w:pPr>
+      <w:r>
+        <w:t>Course Overview</w:t>
+      </w:r>
+    </w:p>
+    <w:p>
+      <w:r>
+        <w:t>This Application Security (AppSec) program is co-designed with cybersecurity experts to train software developers, QA engineers, and security analysts. Master security principles, secure coding strategies, and secure application architecture design.</w:t>
+      </w:r>
+    </w:p>
+    <w:p/>
+    <w:p>
+      <w:pPr>
+        <w:pStyle w:val="Heading2"/>
+      </w:pPr>
+      <w:r>
+        <w:t>Key Features</w:t>
+      </w:r>
+    </w:p>
+    <w:p>
+      <w:r>
+        <w:t>• Interactive CTF labs targeting web exploits</w:t>
+      </w:r>
+    </w:p>
+    <w:p>
+      <w:r>
+        <w:t>• Application Threat Modeling using STRIDE</w:t>
+      </w:r>
+    </w:p>
+    <w:p>
+      <w:r>
+        <w:t>• Static Application Security Testing (SAST) usage</w:t>
+      </w:r>
+    </w:p>
+    <w:p>
+      <w:r>
+        <w:t>• Dynamic Application Security Testing (DAST) labs</w:t>
+      </w:r>
+    </w:p>
+    <w:p>
+      <w:r>
+        <w:t>• Real-world secure coding practice challenge</w:t>
+      </w:r>
+    </w:p>
+    <w:p>
+      <w:r>
+        <w:t>• API access control and security configurations</w:t>
+      </w:r>
+    </w:p>
+    <w:p/>
+    <w:p>
+      <w:pPr>
+        <w:pStyle w:val="Heading2"/>
+      </w:pPr>
+      <w:r>
+        <w:t>Application Security Certification Curriculum</w:t>
+      </w:r>
+    </w:p>
+    <w:p>
+      <w:r>
+        <w:t>The Application Security training curriculum runs through core vulnerability exploits, secure application coding, threat modeling designs, and automated testing.</w:t>
+      </w:r>
+    </w:p>
+    <w:p>
+      <w:pPr>
+        <w:pStyle w:val="Heading3"/>
+      </w:pPr>
+      <w:r>
+        <w:t>Module 1 – Core Web &amp; Security Architectures</w:t>
+      </w:r>
+    </w:p>
+    <w:p>
+      <w:r>
+        <w:t>• Understanding web requests flow and browser controls</w:t>
+      </w:r>
+    </w:p>
+    <w:p>
+      <w:r>
+        <w:t>• Introduction to HTTP headers security controls</w:t>
+      </w:r>
+    </w:p>
+    <w:p>
+      <w:r>
+        <w:t>• Principles of least privilege and secure-by-design concepts</w:t>
+      </w:r>
+    </w:p>
+    <w:p>
+      <w:pPr>
+        <w:pStyle w:val="Heading3"/>
+      </w:pPr>
+      <w:r>
+        <w:t>Module 2 – OWASP Top 10 - Vulnerability &amp; Mitigation</w:t>
+      </w:r>
+    </w:p>
+    <w:p>
+      <w:r>
+        <w:t>• SQL Injection and Cross-Site Scripting (XSS) attack vectors</w:t>
+      </w:r>
+    </w:p>
+    <w:p>
+      <w:r>
+        <w:t>• Broken authentication and session management exploits</w:t>
+      </w:r>
+    </w:p>
+    <w:p>
+      <w:r>
+        <w:t>• Mitigating data exposures and security misconfigurations</w:t>
+      </w:r>
+    </w:p>
+    <w:p>
+      <w:pPr>
+        <w:pStyle w:val="Heading3"/>
+      </w:pPr>
+      <w:r>
+        <w:t>Module 3 – Threat Modeling &amp; Design Principles (STRIDE)</w:t>
+      </w:r>
+    </w:p>
+    <w:p>
+      <w:r>
+        <w:t>• Understanding STRIDE threat categories</w:t>
+      </w:r>
+    </w:p>
+    <w:p>
+      <w:r>
+        <w:t>• Building data flow diagrams for application mapping</w:t>
+      </w:r>
+    </w:p>
+    <w:p>
+      <w:r>
+        <w:t>• Documenting risk mitigations and architectural defenses</w:t>
+      </w:r>
+    </w:p>
+    <w:p>
+      <w:pPr>
+        <w:pStyle w:val="Heading3"/>
+      </w:pPr>
+      <w:r>
+        <w:t>Module 4 – Secure Development Lifecycle (SDLC)</w:t>
+      </w:r>
+    </w:p>
+    <w:p>
+      <w:r>
+        <w:t>• Integrating security audits inside Agile frameworks</w:t>
+      </w:r>
+    </w:p>
+    <w:p>
+      <w:r>
+        <w:t>• Managing third-party dependencies vulnerabilities</w:t>
+      </w:r>
+    </w:p>
+    <w:p>
+      <w:r>
+        <w:t>• Configuring software composition analysis (SCA)</w:t>
+      </w:r>
+    </w:p>
+    <w:p>
+      <w:pPr>
+        <w:pStyle w:val="Heading3"/>
+      </w:pPr>
+      <w:r>
+        <w:t>Module 5 – Secure Code Review &amp; Static Analysis (SAST)</w:t>
+      </w:r>
+    </w:p>
+    <w:p>
+      <w:r>
+        <w:t>• Identifying common security flaws in source code</w:t>
+      </w:r>
+    </w:p>
+    <w:p>
+      <w:r>
+        <w:t>• Configuring SAST scanners inside code repositories</w:t>
+      </w:r>
+    </w:p>
+    <w:p>
+      <w:r>
+        <w:t>• Managing false positives outputs</w:t>
+      </w:r>
+    </w:p>
+    <w:p>
+      <w:pPr>
+        <w:pStyle w:val="Heading3"/>
+      </w:pPr>
+      <w:r>
+        <w:t>Module 6 – Dynamic Vulnerability Scanning &amp; Penetration (DAST)</w:t>
+      </w:r>
+    </w:p>
+    <w:p>
+      <w:r>
+        <w:t>• Running scans using OWASP ZAP configurations</w:t>
+      </w:r>
+    </w:p>
+    <w:p>
+      <w:r>
+        <w:t>• Using Burp Suite for basic request interception</w:t>
+      </w:r>
+    </w:p>
+    <w:p>
+      <w:r>
+        <w:t>• Conducting runtime vulnerability verifications</w:t>
+      </w:r>
+    </w:p>
+    <w:p>
+      <w:pPr>
+        <w:pStyle w:val="Heading3"/>
+      </w:pPr>
+      <w:r>
+        <w:t>Module 7 – Web API &amp; Authentication Hardening</w:t>
+      </w:r>
+    </w:p>
+    <w:p>
+      <w:r>
+        <w:t>• Securing REST and GraphQL API routes</w:t>
+      </w:r>
+    </w:p>
+    <w:p>
+      <w:r>
+        <w:t>• Configuring CORS and JWT authentication rules</w:t>
+      </w:r>
+    </w:p>
+    <w:p>
+      <w:r>
+        <w:t>• Implementing rate limiting protections</w:t>
+      </w:r>
+    </w:p>
+    <w:p/>
+    <w:p>
+      <w:pPr>
+        <w:pStyle w:val="Heading2"/>
+      </w:pPr>
+      <w:r>
+        <w:t>Skills You’ll Master</w:t>
+      </w:r>
+    </w:p>
+    <w:p>
+      <w:r>
+        <w:t>After completing this Application Security course, you will gain:</w:t>
+      </w:r>
+    </w:p>
+    <w:p>
+      <w:r>
+        <w:t>• OWASP Top 10 vulnerabilities mitigation</w:t>
+      </w:r>
+    </w:p>
+    <w:p>
+      <w:r>
+        <w:t>• Application risk modeling using STRIDE</w:t>
+      </w:r>
+    </w:p>
+    <w:p>
+      <w:r>
+        <w:t>• Static source analysis configurations (SAST)</w:t>
+      </w:r>
+    </w:p>
+    <w:p>
+      <w:r>
+        <w:t>• Dynamic run penetration scanning tools (DAST)</w:t>
+      </w:r>
+    </w:p>
+    <w:p>
+      <w:r>
+        <w:t>• Security vulnerability remediation configurations</w:t>
+      </w:r>
+    </w:p>
+    <w:p>
+      <w:r>
+        <w:t>• REST &amp; GraphQL API access control security</w:t>
+      </w:r>
+    </w:p>
+    <w:p/>
+    <w:p>
+      <w:pPr>
+        <w:pStyle w:val="Heading2"/>
+      </w:pPr>
+      <w:r>
+        <w:t>Course Highlights</w:t>
+      </w:r>
+    </w:p>
+    <w:p>
+      <w:r>
+        <w:t>• OWASP Top 10 Mitigations</w:t>
+      </w:r>
+    </w:p>
+    <w:p>
+      <w:r>
+        <w:t>• Threat Modeling Frameworks</w:t>
+      </w:r>
+    </w:p>
+    <w:p>
+      <w:r>
+        <w:t>• API Defense Architectures</w:t>
+      </w:r>
+    </w:p>
+    <w:p>
+      <w:r>
+        <w:t>• Security Review Methodology</w:t>
+      </w:r>
+    </w:p>
+    <w:p/>
+    <w:p>
+      <w:pPr>
+        <w:pStyle w:val="Heading2"/>
+      </w:pPr>
+      <w:r>
+        <w:t>Learning Outcomes</w:t>
+      </w:r>
+    </w:p>
+    <w:p>
+      <w:r>
+        <w:t>By the end of this course, you will be able to:</w:t>
+      </w:r>
+    </w:p>
+    <w:p>
+      <w:r>
+        <w:t>• Identify and repair SQL Injection and XSS coding faults</w:t>
+      </w:r>
+    </w:p>
+    <w:p>
+      <w:r>
+        <w:t>• Construct threat models for multi-service applications using STRIDE</w:t>
+      </w:r>
+    </w:p>
+    <w:p>
+      <w:r>
+        <w:t>• Deploy SAST scanners to screen source repositories during builds</w:t>
+      </w:r>
+    </w:p>
+    <w:p>
+      <w:r>
+        <w:t>• Configure runtime application scanners using OWASP ZAP configurations</w:t>
+      </w:r>
+    </w:p>
+    <w:p>
+      <w:r>
+        <w:t>• Secure web API endpoints utilizing JWT and secure CORS settings</w:t>
+      </w:r>
+    </w:p>
+    <w:p>
+      <w:r>
+        <w:t>• Establish dependency scanning to clean vulnerability packages</w:t>
+      </w:r>
+    </w:p>
+    <w:p/>
+    <w:p>
+      <w:pPr>
+        <w:pStyle w:val="Heading2"/>
+      </w:pPr>
+      <w:r>
+        <w:t>Program Criteria – Eligibility</w:t>
+      </w:r>
+    </w:p>
+    <w:p>
+      <w:pPr>
+        <w:pStyle w:val="Heading3"/>
+      </w:pPr>
+      <w:r>
+        <w:t>Prerequisites</w:t>
+      </w:r>
+    </w:p>
+    <w:p>
+      <w:r>
+        <w:t>• Basic knowledge of web development (HTML, CSS, JavaScript)</w:t>
+      </w:r>
+    </w:p>
+    <w:p>
+      <w:r>
+        <w:t>• Familiarity with SQL and backend web programming concepts</w:t>
+      </w:r>
+    </w:p>
+    <w:p>
+      <w:pPr>
+        <w:pStyle w:val="Heading3"/>
+      </w:pPr>
+      <w:r>
+        <w:t>Suitable For</w:t>
+      </w:r>
+    </w:p>
+    <w:p>
+      <w:r>
+        <w:t>• Software Developers aiming to improve security skills</w:t>
+      </w:r>
+    </w:p>
+    <w:p>
+      <w:r>
+        <w:t>• QA Engineers transitioning to security testing roles</w:t>
+      </w:r>
+    </w:p>
+    <w:p>
+      <w:r>
+        <w:t>• Security Analysts seeking structured application testing paths</w:t>
+      </w:r>
+    </w:p>
+    <w:p>
+      <w:r>
+        <w:t>• Tech Leads designing secure software systems</w:t>
+      </w:r>
+    </w:p>
+    <w:p/>
+    <w:p>
+      <w:pPr>
+        <w:pStyle w:val="Heading2"/>
+      </w:pPr>
+      <w:r>
+        <w:t>Why Join This Program?</w:t>
+      </w:r>
+    </w:p>
+    <w:p>
+      <w:r>
+        <w:t>• Acquire critical secure coding capabilities needed by tech firms</w:t>
+      </w:r>
+    </w:p>
+    <w:p>
+      <w:r>
+        <w:t>• Learn threat modeling layouts used by enterprise architects</w:t>
+      </w:r>
+    </w:p>
+    <w:p>
+      <w:r>
+        <w:t>• Interact with real security penetration testing software tools</w:t>
+      </w:r>
+    </w:p>
+    <w:p>
+      <w:r>
+        <w:t>• Earn an Application Security training certificate validation</w:t>
+      </w:r>
+    </w:p>
+    <w:p/>
+    <w:p>
+      <w:pPr>
+        <w:pStyle w:val="Heading2"/>
+      </w:pPr>
+      <w:r>
+        <w:t>Frequently Asked Questions</w:t>
+      </w:r>
+    </w:p>
+    <w:p>
+      <w:r>
+        <w:rPr>
+          <w:b/>
+        </w:rPr>
+        <w:t>Do I need programming experience for this course?</w:t>
+      </w:r>
+    </w:p>
+    <w:p>
+      <w:r>
+        <w:t>Yes, basic web programming concepts (HTML/JS/Node/Python) are essential for secure code exercises.</w:t>
+      </w:r>
+    </w:p>
+    <w:p/>
+    <w:p>
+      <w:r>
+        <w:rPr>
+          <w:b/>
+        </w:rPr>
+        <w:t>Does this course cover penetration testing?</w:t>
+      </w:r>
+    </w:p>
+    <w:p>
+      <w:r>
+        <w:t>It covers basic app-level testing using tools like Burp Suite and OWASP ZAP, but focuses primarily on defensive secure coding.</w:t>
+      </w:r>
+    </w:p>
+    <w:p/>
+    <w:p>
+      <w:r>
+        <w:rPr>
+          <w:b/>
+        </w:rPr>
+        <w:t>Will I receive certificate validation?</w:t>
+      </w:r>
+    </w:p>
+    <w:p>
+      <w:r>
+        <w:t>Yes, an Application Security certificate will be issued upon completion.</w:t>
+      </w:r>
+    </w:p>
+    <w:p/>
+    <w:p>
+      <w:r>
+        <w:br w:type="page"/>
+      </w:r>
+    </w:p>
+    <w:p>
+      <w:pPr>
+        <w:pStyle w:val="Heading1"/>
+      </w:pPr>
+      <w:r>
+        <w:t>Network Security &amp; Defense Program – Cyber Defense</w:t>
+      </w:r>
+    </w:p>
+    <w:p>
+      <w:r>
+        <w:rPr>
+          <w:i/>
+        </w:rPr>
+        <w:t>Network Security &amp; Defense Program – Cyber Defense Training</w:t>
+      </w:r>
+    </w:p>
+    <w:p/>
+    <w:p>
+      <w:r>
+        <w:t>Gain a strong foundation in networking security, defensive configurations, packet analysis, and secure architectures. Learn firewalls, VPNs, IDS/IPS, and Zero Trust design. This course prepares network administrators, system operators, and security analyst beginners with fundamental network security infrastructure skills.</w:t>
+      </w:r>
+    </w:p>
+    <w:p/>
+    <w:p>
+      <w:pPr>
+        <w:pStyle w:val="Heading2"/>
+      </w:pPr>
+      <w:r>
+        <w:t>Course Overview</w:t>
+      </w:r>
+    </w:p>
+    <w:p>
+      <w:r>
+        <w:t>This program provides foundational and practical cybersecurity networking expertise. Learn how to map networks, read traffic, set up firewalls, isolate systems, configure secure tunnels, and implement modern Zero Trust network designs.</w:t>
+      </w:r>
+    </w:p>
+    <w:p/>
+    <w:p>
+      <w:pPr>
+        <w:pStyle w:val="Heading2"/>
+      </w:pPr>
+      <w:r>
+        <w:t>Key Features</w:t>
+      </w:r>
+    </w:p>
+    <w:p>
+      <w:r>
+        <w:t>• Port scanning and discovery using Nmap</w:t>
+      </w:r>
+    </w:p>
+    <w:p>
+      <w:r>
+        <w:t>• Deep packet analysis using Wireshark</w:t>
+      </w:r>
+    </w:p>
+    <w:p>
+      <w:r>
+        <w:t>• Network firewall configuration and access rules</w:t>
+      </w:r>
+    </w:p>
+    <w:p>
+      <w:r>
+        <w:t>• Setup of Virtual Private Networks (VPNs)</w:t>
+      </w:r>
+    </w:p>
+    <w:p>
+      <w:r>
+        <w:t>• Configuration of WAF and IDS/IPS sensors</w:t>
+      </w:r>
+    </w:p>
+    <w:p>
+      <w:r>
+        <w:t>• Zero Trust architecture migration project</w:t>
+      </w:r>
+    </w:p>
+    <w:p/>
+    <w:p>
+      <w:pPr>
+        <w:pStyle w:val="Heading2"/>
+      </w:pPr>
+      <w:r>
+        <w:t>Network Security &amp; Defense Program Curriculum</w:t>
+      </w:r>
+    </w:p>
+    <w:p>
+      <w:r>
+        <w:t>The Network Security training curriculum covers networking protocols, network discovery scanning, traffic capture, boundary protections, secure endpoints, and Zero Trust models.</w:t>
+      </w:r>
+    </w:p>
+    <w:p>
+      <w:pPr>
+        <w:pStyle w:val="Heading3"/>
+      </w:pPr>
+      <w:r>
+        <w:t>Module 1 – OSI Model, Networking &amp; Security Protocols</w:t>
+      </w:r>
+    </w:p>
+    <w:p>
+      <w:r>
+        <w:t>• Understanding TCP/UDP protocols and common port mappings</w:t>
+      </w:r>
+    </w:p>
+    <w:p>
+      <w:r>
+        <w:t>• Routing, switching, and subnet allocation topologies</w:t>
+      </w:r>
+    </w:p>
+    <w:p>
+      <w:r>
+        <w:t>• Securing DHCP, DNS, and HTTP operations</w:t>
+      </w:r>
+    </w:p>
+    <w:p>
+      <w:pPr>
+        <w:pStyle w:val="Heading3"/>
+      </w:pPr>
+      <w:r>
+        <w:t>Module 2 – Network Reconnaissance &amp; Port Scanning (Nmap)</w:t>
+      </w:r>
+    </w:p>
+    <w:p>
+      <w:r>
+        <w:t>• Running discovery scans using Nmap scripts</w:t>
+      </w:r>
+    </w:p>
+    <w:p>
+      <w:r>
+        <w:t>• Analyzing open ports and operating system signatures</w:t>
+      </w:r>
+    </w:p>
+    <w:p>
+      <w:r>
+        <w:t>• Detecting network scan attempts</w:t>
+      </w:r>
+    </w:p>
+    <w:p>
+      <w:pPr>
+        <w:pStyle w:val="Heading3"/>
+      </w:pPr>
+      <w:r>
+        <w:t>Module 3 – Packet Analysis &amp; Capturing (Wireshark)</w:t>
+      </w:r>
+    </w:p>
+    <w:p>
+      <w:r>
+        <w:t>• Configuring packet capture interfaces in Wireshark</w:t>
+      </w:r>
+    </w:p>
+    <w:p>
+      <w:r>
+        <w:t>• Filtering traffic and reconstructing TCP streams</w:t>
+      </w:r>
+    </w:p>
+    <w:p>
+      <w:r>
+        <w:t>• Identifying malicious packets and protocol anomalies</w:t>
+      </w:r>
+    </w:p>
+    <w:p>
+      <w:pPr>
+        <w:pStyle w:val="Heading3"/>
+      </w:pPr>
+      <w:r>
+        <w:t>Module 4 – Firewall Deployment &amp; Rule Architectures</w:t>
+      </w:r>
+    </w:p>
+    <w:p>
+      <w:r>
+        <w:t>• Stateful vs stateless firewall rule structures</w:t>
+      </w:r>
+    </w:p>
+    <w:p>
+      <w:r>
+        <w:t>• Configuring NAT and boundary routing policies</w:t>
+      </w:r>
+    </w:p>
+    <w:p>
+      <w:r>
+        <w:t>• Setting up demilitarized zones (DMZ) setups</w:t>
+      </w:r>
+    </w:p>
+    <w:p>
+      <w:pPr>
+        <w:pStyle w:val="Heading3"/>
+      </w:pPr>
+      <w:r>
+        <w:t>Module 5 – Intrusion Detection &amp; Prevention Systems (IDS/IPS)</w:t>
+      </w:r>
+    </w:p>
+    <w:p>
+      <w:r>
+        <w:t>• Configuring rule alerts in Snort IDS/IPS</w:t>
+      </w:r>
+    </w:p>
+    <w:p>
+      <w:r>
+        <w:t>• Deploying Web Application Firewalls (WAF) setups</w:t>
+      </w:r>
+    </w:p>
+    <w:p>
+      <w:r>
+        <w:t>• Analyzing security logs for event correlation</w:t>
+      </w:r>
+    </w:p>
+    <w:p>
+      <w:pPr>
+        <w:pStyle w:val="Heading3"/>
+      </w:pPr>
+      <w:r>
+        <w:t>Module 6 – Secure remote access (VPNs, TLS, Cryptography)</w:t>
+      </w:r>
+    </w:p>
+    <w:p>
+      <w:r>
+        <w:t>• Understanding symmetric and asymmetric cryptography models</w:t>
+      </w:r>
+    </w:p>
+    <w:p>
+      <w:r>
+        <w:t>• Deploying secure tunnels using OpenVPN and WireGuard</w:t>
+      </w:r>
+    </w:p>
+    <w:p>
+      <w:r>
+        <w:t>• Configuring secure TLS certificates protocols</w:t>
+      </w:r>
+    </w:p>
+    <w:p>
+      <w:pPr>
+        <w:pStyle w:val="Heading3"/>
+      </w:pPr>
+      <w:r>
+        <w:t>Module 7 – Zero Trust Network Architecture &amp; Identity Controls</w:t>
+      </w:r>
+    </w:p>
+    <w:p>
+      <w:r>
+        <w:t>• Designing perimeter-less networks utilizing Zero Trust concepts</w:t>
+      </w:r>
+    </w:p>
+    <w:p>
+      <w:r>
+        <w:t>• Configuring software defined perimeters (SDP)</w:t>
+      </w:r>
+    </w:p>
+    <w:p>
+      <w:r>
+        <w:t>• Implementing multi-factor authentication (MFA) network controls</w:t>
+      </w:r>
+    </w:p>
+    <w:p/>
+    <w:p>
+      <w:pPr>
+        <w:pStyle w:val="Heading2"/>
+      </w:pPr>
+      <w:r>
+        <w:t>Skills You’ll Master</w:t>
+      </w:r>
+    </w:p>
+    <w:p>
+      <w:r>
+        <w:t>After completing this Network Security &amp; Defense course, you will gain:</w:t>
+      </w:r>
+    </w:p>
+    <w:p>
+      <w:r>
+        <w:t>• Network device packet analysis (Wireshark)</w:t>
+      </w:r>
+    </w:p>
+    <w:p>
+      <w:r>
+        <w:t>• Host and port discovery mapping (Nmap)</w:t>
+      </w:r>
+    </w:p>
+    <w:p>
+      <w:r>
+        <w:t>• Boundary firewall access control rule definition</w:t>
+      </w:r>
+    </w:p>
+    <w:p>
+      <w:r>
+        <w:t>• VPN deployment tunnels implementation</w:t>
+      </w:r>
+    </w:p>
+    <w:p>
+      <w:r>
+        <w:t>• WAF and IDS/IPS sensor operations</w:t>
+      </w:r>
+    </w:p>
+    <w:p>
+      <w:r>
+        <w:t>• Zero Trust network control planning</w:t>
+      </w:r>
+    </w:p>
+    <w:p/>
+    <w:p>
+      <w:pPr>
+        <w:pStyle w:val="Heading2"/>
+      </w:pPr>
+      <w:r>
+        <w:t>Course Highlights</w:t>
+      </w:r>
+    </w:p>
+    <w:p>
+      <w:r>
+        <w:t>• Network Traffic Analysis</w:t>
+      </w:r>
+    </w:p>
+    <w:p>
+      <w:r>
+        <w:t>• Boundary Defense &amp; Firewalls</w:t>
+      </w:r>
+    </w:p>
+    <w:p>
+      <w:r>
+        <w:t>• Intrusion Prevention Systems</w:t>
+      </w:r>
+    </w:p>
+    <w:p>
+      <w:r>
+        <w:t>• Zero Trust Architectures</w:t>
+      </w:r>
+    </w:p>
+    <w:p/>
+    <w:p>
+      <w:pPr>
+        <w:pStyle w:val="Heading2"/>
+      </w:pPr>
+      <w:r>
+        <w:t>Learning Outcomes</w:t>
+      </w:r>
+    </w:p>
+    <w:p>
+      <w:r>
+        <w:t>By the end of this course, you will be able to:</w:t>
+      </w:r>
+    </w:p>
+    <w:p>
+      <w:r>
+        <w:t>• Generate topological port and service maps using Nmap scan audits</w:t>
+      </w:r>
+    </w:p>
+    <w:p>
+      <w:r>
+        <w:t>• Isolate protocol leaks and capture network files using Wireshark configurations</w:t>
+      </w:r>
+    </w:p>
+    <w:p>
+      <w:r>
+        <w:t>• Construct port forwarding and access policies inside firewalls</w:t>
+      </w:r>
+    </w:p>
+    <w:p>
+      <w:r>
+        <w:t>• Configure remote secure tunnel VPN interfaces</w:t>
+      </w:r>
+    </w:p>
+    <w:p>
+      <w:r>
+        <w:t>• Implement alerting alerts rules inside Snort IDS engines</w:t>
+      </w:r>
+    </w:p>
+    <w:p>
+      <w:r>
+        <w:t>• Build architectures for secure identity-centric local networks</w:t>
+      </w:r>
+    </w:p>
+    <w:p/>
+    <w:p>
+      <w:pPr>
+        <w:pStyle w:val="Heading2"/>
+      </w:pPr>
+      <w:r>
+        <w:t>Program Criteria – Eligibility</w:t>
+      </w:r>
+    </w:p>
+    <w:p>
+      <w:pPr>
+        <w:pStyle w:val="Heading3"/>
+      </w:pPr>
+      <w:r>
+        <w:t>Prerequisites</w:t>
+      </w:r>
+    </w:p>
+    <w:p>
+      <w:r>
+        <w:t>• Understanding of basic networking models (OSI and TCP/IP)</w:t>
+      </w:r>
+    </w:p>
+    <w:p>
+      <w:r>
+        <w:t>• Familiarity with command line interfaces</w:t>
+      </w:r>
+    </w:p>
+    <w:p>
+      <w:pPr>
+        <w:pStyle w:val="Heading3"/>
+      </w:pPr>
+      <w:r>
+        <w:t>Suitable For</w:t>
+      </w:r>
+    </w:p>
+    <w:p>
+      <w:r>
+        <w:t>• System Administrators and IT Professionals</w:t>
+      </w:r>
+    </w:p>
+    <w:p>
+      <w:r>
+        <w:t>• Aspiring Cyber Defense and SOC Analysts</w:t>
+      </w:r>
+    </w:p>
+    <w:p>
+      <w:r>
+        <w:t>• Network Administrators wishing to specialize in security</w:t>
+      </w:r>
+    </w:p>
+    <w:p>
+      <w:r>
+        <w:t>• Career switchers targeting network security entry</w:t>
+      </w:r>
+    </w:p>
+    <w:p/>
+    <w:p>
+      <w:pPr>
+        <w:pStyle w:val="Heading2"/>
+      </w:pPr>
+      <w:r>
+        <w:t>Why Join This Program?</w:t>
+      </w:r>
+    </w:p>
+    <w:p>
+      <w:r>
+        <w:t>• Practice networking skills in simulated labs configurations</w:t>
+      </w:r>
+    </w:p>
+    <w:p>
+      <w:r>
+        <w:t>• Prepare for CompTIA Network+ and Security+ certification standards</w:t>
+      </w:r>
+    </w:p>
+    <w:p>
+      <w:r>
+        <w:t>• Obtain capabilities to trace traffic anomalies using Wireshark</w:t>
+      </w:r>
+    </w:p>
+    <w:p>
+      <w:r>
+        <w:t>• Earn a Network Security program training validation certificate</w:t>
+      </w:r>
+    </w:p>
+    <w:p/>
+    <w:p>
+      <w:pPr>
+        <w:pStyle w:val="Heading2"/>
+      </w:pPr>
+      <w:r>
+        <w:t>Frequently Asked Questions</w:t>
+      </w:r>
+    </w:p>
+    <w:p>
+      <w:r>
+        <w:rPr>
+          <w:b/>
+        </w:rPr>
+        <w:t>What tools will I learn to use?</w:t>
+      </w:r>
+    </w:p>
+    <w:p>
+      <w:r>
+        <w:t>Wireshark, Nmap, PfSense Firewall, OpenVPN, Snort IDS, and standard system command line tools.</w:t>
+      </w:r>
+    </w:p>
+    <w:p/>
+    <w:p>
+      <w:r>
+        <w:rPr>
+          <w:b/>
+        </w:rPr>
+        <w:t>Will this help me pass cybersecurity exams?</w:t>
+      </w:r>
+    </w:p>
+    <w:p>
+      <w:r>
+        <w:t>Yes, it is heavily aligned with CompTIA Network+ and Security+ standards.</w:t>
+      </w:r>
+    </w:p>
+    <w:p/>
+    <w:p>
+      <w:r>
+        <w:rPr>
+          <w:b/>
+        </w:rPr>
+        <w:t>Does the course include live lab setups?</w:t>
+      </w:r>
+    </w:p>
+    <w:p>
+      <w:r>
+        <w:t>Yes, you will practice within a virtualized enterprise network setup.</w:t>
+      </w:r>
+    </w:p>
+    <w:p/>
+    <w:p>
+      <w:r>
+        <w:br w:type="page"/>
+      </w:r>
+    </w:p>
+    <w:p>
+      <w:pPr>
+        <w:pStyle w:val="Heading1"/>
+      </w:pPr>
+      <w:r>
+        <w:t>MERN Stack Developer Course – MongoDB, Express, React, Node</w:t>
+      </w:r>
+    </w:p>
+    <w:p>
+      <w:r>
+        <w:rPr>
+          <w:i/>
+        </w:rPr>
+        <w:t>MERN Stack Developer Course – MongoDB, Express, React, Node Training</w:t>
+      </w:r>
+    </w:p>
+    <w:p/>
+    <w:p>
+      <w:r>
+        <w:t>Build production-grade web applications from scratch. Master MongoDB, Express.js, React, Node.js, Redux Toolkit, JWT Auth, API design, and deployment. Acquire the skills to become a Full Stack Developer, Frontend Engineer, or Backend Specialist. This job-oriented program prepares learners for industry roles in dynamic web development.</w:t>
+      </w:r>
+    </w:p>
+    <w:p/>
+    <w:p>
+      <w:pPr>
+        <w:pStyle w:val="Heading2"/>
+      </w:pPr>
+      <w:r>
+        <w:t>Course Overview</w:t>
+      </w:r>
+    </w:p>
+    <w:p>
+      <w:r>
+        <w:t>This comprehensive MERN stack developer course is structured to take you from a basic JavaScript programmer to an enterprise full-stack engineer. Learn clean database modeling, scalable backend API design, robust client-side state handling, and automated web deployments.</w:t>
+      </w:r>
+    </w:p>
+    <w:p/>
+    <w:p>
+      <w:pPr>
+        <w:pStyle w:val="Heading2"/>
+      </w:pPr>
+      <w:r>
+        <w:t>Key Features</w:t>
+      </w:r>
+    </w:p>
+    <w:p>
+      <w:r>
+        <w:t>• Build 4 complete responsive full-stack websites</w:t>
+      </w:r>
+    </w:p>
+    <w:p>
+      <w:r>
+        <w:t>• State management utilizing Redux Toolkit</w:t>
+      </w:r>
+    </w:p>
+    <w:p>
+      <w:r>
+        <w:t>• Backend API creation and custom middleware</w:t>
+      </w:r>
+    </w:p>
+    <w:p>
+      <w:r>
+        <w:t>• Database management and indexing (Mongoose)</w:t>
+      </w:r>
+    </w:p>
+    <w:p>
+      <w:r>
+        <w:t>• Secure token authorization integrations (JWT)</w:t>
+      </w:r>
+    </w:p>
+    <w:p>
+      <w:r>
+        <w:t>• Final project cloud hosting implementation</w:t>
+      </w:r>
+    </w:p>
+    <w:p/>
+    <w:p>
+      <w:pPr>
+        <w:pStyle w:val="Heading2"/>
+      </w:pPr>
+      <w:r>
+        <w:t>MERN Stack Developer Curriculum</w:t>
+      </w:r>
+    </w:p>
+    <w:p>
+      <w:r>
+        <w:t>The MERN stack program runs through HTML/CSS/JavaScript foundations, React components layouts, Node backend codebases, database modeling, and automated cloud releases.</w:t>
+      </w:r>
+    </w:p>
+    <w:p>
+      <w:pPr>
+        <w:pStyle w:val="Heading3"/>
+      </w:pPr>
+      <w:r>
+        <w:t>Module 1 – HTML5, CSS3, &amp; Modern Javascript (ES6+)</w:t>
+      </w:r>
+    </w:p>
+    <w:p>
+      <w:r>
+        <w:t>• Semantic HTML and CSS layout systems (Flexbox, Grid)</w:t>
+      </w:r>
+    </w:p>
+    <w:p>
+      <w:r>
+        <w:t>• Asynchronous JavaScript (Promises, Async/Await)</w:t>
+      </w:r>
+    </w:p>
+    <w:p>
+      <w:r>
+        <w:t>• DOM manipulation, event bindings, and API calls basics</w:t>
+      </w:r>
+    </w:p>
+    <w:p>
+      <w:pPr>
+        <w:pStyle w:val="Heading3"/>
+      </w:pPr>
+      <w:r>
+        <w:t>Module 2 – UI Engineering using React.js Components</w:t>
+      </w:r>
+    </w:p>
+    <w:p>
+      <w:r>
+        <w:t>• Building reusable layouts with React components</w:t>
+      </w:r>
+    </w:p>
+    <w:p>
+      <w:r>
+        <w:t>• Managing components state (useState, useEffect, useContext)</w:t>
+      </w:r>
+    </w:p>
+    <w:p>
+      <w:r>
+        <w:t>• Configuring client routes using React Router</w:t>
+      </w:r>
+    </w:p>
+    <w:p>
+      <w:pPr>
+        <w:pStyle w:val="Heading3"/>
+      </w:pPr>
+      <w:r>
+        <w:t>Module 3 – Global State Management (Redux Toolkit)</w:t>
+      </w:r>
+    </w:p>
+    <w:p>
+      <w:r>
+        <w:t>• Understanding one-way data flows and store configurations</w:t>
+      </w:r>
+    </w:p>
+    <w:p>
+      <w:r>
+        <w:t>• Writing store slices, reducers, and async thunks queries</w:t>
+      </w:r>
+    </w:p>
+    <w:p>
+      <w:r>
+        <w:t>• Integrating Redux hooks with dynamic UI views</w:t>
+      </w:r>
+    </w:p>
+    <w:p>
+      <w:pPr>
+        <w:pStyle w:val="Heading3"/>
+      </w:pPr>
+      <w:r>
+        <w:t>Module 4 – Node.js &amp; Express.js Backend Architecture</w:t>
+      </w:r>
+    </w:p>
+    <w:p>
+      <w:r>
+        <w:t>• Configuring Node runtime server environments</w:t>
+      </w:r>
+    </w:p>
+    <w:p>
+      <w:r>
+        <w:t>• Routing requests and design models in Express</w:t>
+      </w:r>
+    </w:p>
+    <w:p>
+      <w:r>
+        <w:t>• Building request validation middlewares</w:t>
+      </w:r>
+    </w:p>
+    <w:p>
+      <w:pPr>
+        <w:pStyle w:val="Heading3"/>
+      </w:pPr>
+      <w:r>
+        <w:t>Module 5 – Database Modeling with MongoDB &amp; Mongoose</w:t>
+      </w:r>
+    </w:p>
+    <w:p>
+      <w:r>
+        <w:t>• MongoDB document structure and Atlas configuration</w:t>
+      </w:r>
+    </w:p>
+    <w:p>
+      <w:r>
+        <w:t>• Defining data schemas and relations using Mongoose</w:t>
+      </w:r>
+    </w:p>
+    <w:p>
+      <w:r>
+        <w:t>• Performing CRUD queries and index configurations</w:t>
+      </w:r>
+    </w:p>
+    <w:p>
+      <w:pPr>
+        <w:pStyle w:val="Heading3"/>
+      </w:pPr>
+      <w:r>
+        <w:t>Module 6 – API Security, Auth with JWT &amp; Validation</w:t>
+      </w:r>
+    </w:p>
+    <w:p>
+      <w:r>
+        <w:t>• Securing passwords using bcrypt hashing</w:t>
+      </w:r>
+    </w:p>
+    <w:p>
+      <w:r>
+        <w:t>• Configuring token authentication authorizations (JWT)</w:t>
+      </w:r>
+    </w:p>
+    <w:p>
+      <w:r>
+        <w:t>• Building route guards and permissions systems</w:t>
+      </w:r>
+    </w:p>
+    <w:p>
+      <w:pPr>
+        <w:pStyle w:val="Heading3"/>
+      </w:pPr>
+      <w:r>
+        <w:t>Module 7 – Testing, CI/CD, &amp; Cloud Production Deployment</w:t>
+      </w:r>
+    </w:p>
+    <w:p>
+      <w:r>
+        <w:t>• Writing backend endpoints tests (Jest &amp; Supertest)</w:t>
+      </w:r>
+    </w:p>
+    <w:p>
+      <w:r>
+        <w:t>• Deploying React apps to Vercel/Netlify hosting environments</w:t>
+      </w:r>
+    </w:p>
+    <w:p>
+      <w:r>
+        <w:t>• Hosting Express backends on Render and connecting MongoDB Atlas</w:t>
+      </w:r>
+    </w:p>
+    <w:p/>
+    <w:p>
+      <w:pPr>
+        <w:pStyle w:val="Heading2"/>
+      </w:pPr>
+      <w:r>
+        <w:t>Skills You’ll Master</w:t>
+      </w:r>
+    </w:p>
+    <w:p>
+      <w:r>
+        <w:t>After completing this MERN Stack Developer course, you will gain:</w:t>
+      </w:r>
+    </w:p>
+    <w:p>
+      <w:r>
+        <w:t>• Modern JavaScript (ES6) coding capabilities</w:t>
+      </w:r>
+    </w:p>
+    <w:p>
+      <w:r>
+        <w:t>• React interface design and routing structures</w:t>
+      </w:r>
+    </w:p>
+    <w:p>
+      <w:r>
+        <w:t>• Global client state configurations (Redux Toolkit)</w:t>
+      </w:r>
+    </w:p>
+    <w:p>
+      <w:r>
+        <w:t>• Node.js server design and Express routing</w:t>
+      </w:r>
+    </w:p>
+    <w:p>
+      <w:r>
+        <w:t>• Mongoose modeling and indexing configurations</w:t>
+      </w:r>
+    </w:p>
+    <w:p>
+      <w:r>
+        <w:t>• Token authorization security integration (JWT)</w:t>
+      </w:r>
+    </w:p>
+    <w:p>
+      <w:r>
+        <w:t>• Backend unit test validation using Jest</w:t>
+      </w:r>
+    </w:p>
+    <w:p>
+      <w:r>
+        <w:t>• Vercel and Render hosting deployments</w:t>
+      </w:r>
+    </w:p>
+    <w:p/>
+    <w:p>
+      <w:pPr>
+        <w:pStyle w:val="Heading2"/>
+      </w:pPr>
+      <w:r>
+        <w:t>Course Highlights</w:t>
+      </w:r>
+    </w:p>
+    <w:p>
+      <w:r>
+        <w:t>• Full-Stack App Development</w:t>
+      </w:r>
+    </w:p>
+    <w:p>
+      <w:r>
+        <w:t>• State Management with Redux</w:t>
+      </w:r>
+    </w:p>
+    <w:p>
+      <w:r>
+        <w:t>• Securing API Auth (JWT)</w:t>
+      </w:r>
+    </w:p>
+    <w:p>
+      <w:r>
+        <w:t>• Cloud Hosting Deployment</w:t>
+      </w:r>
+    </w:p>
+    <w:p/>
+    <w:p>
+      <w:pPr>
+        <w:pStyle w:val="Heading2"/>
+      </w:pPr>
+      <w:r>
+        <w:t>Learning Outcomes</w:t>
+      </w:r>
+    </w:p>
+    <w:p>
+      <w:r>
+        <w:t>By the end of this course, you will be able to:</w:t>
+      </w:r>
+    </w:p>
+    <w:p>
+      <w:r>
+        <w:t>• Construct modular frontend pages using React code</w:t>
+      </w:r>
+    </w:p>
+    <w:p>
+      <w:r>
+        <w:t>• Manage store state across views using Redux slices</w:t>
+      </w:r>
+    </w:p>
+    <w:p>
+      <w:r>
+        <w:t>• Build REST server endpoints using Express configurations</w:t>
+      </w:r>
+    </w:p>
+    <w:p>
+      <w:r>
+        <w:t>• Design custom databases and query indices in MongoDB Atlas</w:t>
+      </w:r>
+    </w:p>
+    <w:p>
+      <w:r>
+        <w:t>• Secure routes using encryption filters and token tokens systems</w:t>
+      </w:r>
+    </w:p>
+    <w:p>
+      <w:r>
+        <w:t>• Publish full application codebases live on Vercel and Render services</w:t>
+      </w:r>
+    </w:p>
+    <w:p/>
+    <w:p>
+      <w:pPr>
+        <w:pStyle w:val="Heading2"/>
+      </w:pPr>
+      <w:r>
+        <w:t>Program Criteria – Eligibility</w:t>
+      </w:r>
+    </w:p>
+    <w:p>
+      <w:pPr>
+        <w:pStyle w:val="Heading3"/>
+      </w:pPr>
+      <w:r>
+        <w:t>Prerequisites</w:t>
+      </w:r>
+    </w:p>
+    <w:p>
+      <w:r>
+        <w:t>• Basic understanding of HTML and CSS</w:t>
+      </w:r>
+    </w:p>
+    <w:p>
+      <w:r>
+        <w:t>• Fundamental knowledge of JavaScript syntax</w:t>
+      </w:r>
+    </w:p>
+    <w:p>
+      <w:pPr>
+        <w:pStyle w:val="Heading3"/>
+      </w:pPr>
+      <w:r>
+        <w:t>Suitable For</w:t>
+      </w:r>
+    </w:p>
+    <w:p>
+      <w:r>
+        <w:t>• Graduates looking to enter web development roles</w:t>
+      </w:r>
+    </w:p>
+    <w:p>
+      <w:r>
+        <w:t>• Frontend developers transitioning to full-stack</w:t>
+      </w:r>
+    </w:p>
+    <w:p>
+      <w:r>
+        <w:t>• Self-taught coders building web application portfolios</w:t>
+      </w:r>
+    </w:p>
+    <w:p>
+      <w:r>
+        <w:t>• Engineers wishing to learn MERN stack patterns</w:t>
+      </w:r>
+    </w:p>
+    <w:p/>
+    <w:p>
+      <w:pPr>
+        <w:pStyle w:val="Heading2"/>
+      </w:pPr>
+      <w:r>
+        <w:t>Why Join This Program?</w:t>
+      </w:r>
+    </w:p>
+    <w:p>
+      <w:r>
+        <w:t>• Build 4 real full-stack portfolio systems</w:t>
+      </w:r>
+    </w:p>
+    <w:p>
+      <w:r>
+        <w:t>• Acquire coding expertise in the dominant JavaScript stack</w:t>
+      </w:r>
+    </w:p>
+    <w:p>
+      <w:r>
+        <w:t>• Learn routing, authentication, and cloud deployment steps from scratch</w:t>
+      </w:r>
+    </w:p>
+    <w:p>
+      <w:r>
+        <w:t>• Receive full career mentorship and certification credentials</w:t>
+      </w:r>
+    </w:p>
+    <w:p/>
+    <w:p>
+      <w:pPr>
+        <w:pStyle w:val="Heading2"/>
+      </w:pPr>
+      <w:r>
+        <w:t>Frequently Asked Questions</w:t>
+      </w:r>
+    </w:p>
+    <w:p>
+      <w:r>
+        <w:rPr>
+          <w:b/>
+        </w:rPr>
+        <w:t>Will I build real applications during the course?</w:t>
+      </w:r>
+    </w:p>
+    <w:p>
+      <w:r>
+        <w:t>Yes, you will build 4 full-stack projects, including a fully-featured E-Commerce site and a Collaborative Social App.</w:t>
+      </w:r>
+    </w:p>
+    <w:p/>
+    <w:p>
+      <w:r>
+        <w:rPr>
+          <w:b/>
+        </w:rPr>
+        <w:t>Do I need backend experience to start this program?</w:t>
+      </w:r>
+    </w:p>
+    <w:p>
+      <w:r>
+        <w:t>No, we teach Node.js, Express, and MongoDB operations from scratch.</w:t>
+      </w:r>
+    </w:p>
+    <w:p/>
+    <w:p>
+      <w:r>
+        <w:rPr>
+          <w:b/>
+        </w:rPr>
+        <w:t>Will I learn cloud hosting?</w:t>
+      </w:r>
+    </w:p>
+    <w:p>
+      <w:r>
+        <w:t>Yes, we cover deploying frontends to Vercel/Netlify and backends to Render, Railway, or AWS.</w:t>
+      </w:r>
+    </w:p>
+    <w:p/>
     <w:sectPr>
       <w:type w:val="nextPage"/>
       <w:pgSz w:h="15840" w:w="12240" w:orient="portrait"/>

</xml_diff>